<commit_message>
Update root-level Word templates (landscape irrigation dropdown added back)
Co-Authored-By: Claude Sonnet 4.6 <noreply@anthropic.com>
</commit_message>
<xml_diff>
--- a/DATE-GIWREF-Address-SMP-MixUse-2022-A.docx
+++ b/DATE-GIWREF-Address-SMP-MixUse-2022-A.docx
@@ -224,7 +224,7 @@
                 <w:sz w:val="20"/>
                 <w:lang w:val="en-US"/>
               </w:rPr>
-              <w:t>17 June 2026</w:t>
+              <w:t>19 June 2026</w:t>
             </w:r>
             <w:r>
               <w:rPr>
@@ -1493,6 +1493,7 @@
               </w:rPr>
               <w:br/>
             </w:r>
+            <w:proofErr w:type="spellStart"/>
             <w:r>
               <w:rPr>
                 <w:b/>
@@ -1502,6 +1503,7 @@
               </w:rPr>
               <w:t>Firstname</w:t>
             </w:r>
+            <w:proofErr w:type="spellEnd"/>
             <w:r>
               <w:rPr>
                 <w:b/>
@@ -1762,11 +1764,11 @@
         <w:br w:type="page"/>
       </w:r>
     </w:p>
-    <w:bookmarkStart w:id="19" w:name="_Toc209592307" w:displacedByCustomXml="next"/>
-    <w:bookmarkStart w:id="20" w:name="_Toc209557015" w:displacedByCustomXml="next"/>
+    <w:bookmarkStart w:id="19" w:name="_Toc231555515" w:displacedByCustomXml="next"/>
+    <w:bookmarkStart w:id="20" w:name="_Toc209555290" w:displacedByCustomXml="next"/>
     <w:bookmarkStart w:id="21" w:name="_Toc209555543" w:displacedByCustomXml="next"/>
-    <w:bookmarkStart w:id="22" w:name="_Toc209555290" w:displacedByCustomXml="next"/>
-    <w:bookmarkStart w:id="23" w:name="_Toc231555515" w:displacedByCustomXml="next"/>
+    <w:bookmarkStart w:id="22" w:name="_Toc209557015" w:displacedByCustomXml="next"/>
+    <w:bookmarkStart w:id="23" w:name="_Toc209592307" w:displacedByCustomXml="next"/>
     <w:sdt>
       <w:sdtPr>
         <w:rPr>
@@ -3729,11 +3731,24 @@
       <w:r>
         <w:t>XX</w:t>
       </w:r>
+      <w:proofErr w:type="gramStart"/>
       <w:r>
         <w:t>]</w:t>
       </w:r>
       <w:r>
-        <w:t xml:space="preserve">  x 1 bedroom apartments</w:t>
+        <w:t xml:space="preserve">  x</w:t>
+      </w:r>
+      <w:proofErr w:type="gramEnd"/>
+      <w:r>
+        <w:t xml:space="preserve"> </w:t>
+      </w:r>
+      <w:proofErr w:type="gramStart"/>
+      <w:r>
+        <w:t>1 bedroom</w:t>
+      </w:r>
+      <w:proofErr w:type="gramEnd"/>
+      <w:r>
+        <w:t xml:space="preserve"> apartments</w:t>
       </w:r>
     </w:p>
     <w:p>
@@ -3755,7 +3770,15 @@
         <w:t>]</w:t>
       </w:r>
       <w:r>
-        <w:t xml:space="preserve"> x 2 bedroom apartments</w:t>
+        <w:t xml:space="preserve"> x </w:t>
+      </w:r>
+      <w:proofErr w:type="gramStart"/>
+      <w:r>
+        <w:t>2 bedroom</w:t>
+      </w:r>
+      <w:proofErr w:type="gramEnd"/>
+      <w:r>
+        <w:t xml:space="preserve"> apartments</w:t>
       </w:r>
     </w:p>
     <w:p>
@@ -3777,7 +3800,15 @@
         <w:t>]</w:t>
       </w:r>
       <w:r>
-        <w:t xml:space="preserve"> x 3 bedroom apartments</w:t>
+        <w:t xml:space="preserve"> x </w:t>
+      </w:r>
+      <w:proofErr w:type="gramStart"/>
+      <w:r>
+        <w:t>3 bedroom</w:t>
+      </w:r>
+      <w:proofErr w:type="gramEnd"/>
+      <w:r>
+        <w:t xml:space="preserve"> apartments</w:t>
       </w:r>
     </w:p>
     <w:p>
@@ -3962,8 +3993,13 @@
       <w:r>
         <w:t xml:space="preserve"> - </w:t>
       </w:r>
+      <w:proofErr w:type="gramStart"/>
       <w:r>
-        <w:t xml:space="preserve">Pre-existing sites at </w:t>
+        <w:t>Pre-existing</w:t>
+      </w:r>
+      <w:proofErr w:type="gramEnd"/>
+      <w:r>
+        <w:t xml:space="preserve"> sites at </w:t>
       </w:r>
       <w:sdt>
         <w:sdtPr>
@@ -6127,7 +6163,7 @@
                 <w:color w:val="000000"/>
               </w:rPr>
               <w:drawing>
-                <wp:anchor distT="0" distB="0" distL="114300" distR="114300" simplePos="0" relativeHeight="251738112" behindDoc="1" locked="0" layoutInCell="1" allowOverlap="1" wp14:anchorId="22787630" wp14:editId="0ED3CC1E">
+                <wp:anchor distT="0" distB="0" distL="114300" distR="114300" simplePos="0" relativeHeight="251738112" behindDoc="1" locked="0" layoutInCell="1" allowOverlap="1" wp14:anchorId="22787630" wp14:editId="2E8DFD95">
                   <wp:simplePos x="0" y="0"/>
                   <wp:positionH relativeFrom="column">
                     <wp:posOffset>77470</wp:posOffset>
@@ -6253,13 +6289,23 @@
             <w:r>
               <w:fldChar w:fldCharType="end"/>
             </w:r>
+            <w:proofErr w:type="spellStart"/>
             <w:r>
               <w:rPr>
                 <w:rFonts w:eastAsiaTheme="minorEastAsia"/>
                 <w:szCs w:val="22"/>
                 <w:lang w:eastAsia="en-US"/>
               </w:rPr>
-              <w:t>NatHERS Energy Rating.</w:t>
+              <w:t>NatHERS</w:t>
+            </w:r>
+            <w:proofErr w:type="spellEnd"/>
+            <w:r>
+              <w:rPr>
+                <w:rFonts w:eastAsiaTheme="minorEastAsia"/>
+                <w:szCs w:val="22"/>
+                <w:lang w:eastAsia="en-US"/>
+              </w:rPr>
+              <w:t xml:space="preserve"> Energy Rating.</w:t>
             </w:r>
           </w:p>
         </w:tc>
@@ -6590,7 +6636,7 @@
                 <w:color w:val="000000"/>
               </w:rPr>
               <w:drawing>
-                <wp:anchor distT="0" distB="0" distL="114300" distR="114300" simplePos="0" relativeHeight="251739136" behindDoc="1" locked="0" layoutInCell="1" allowOverlap="1" wp14:anchorId="7055ECC5" wp14:editId="50DECFB9">
+                <wp:anchor distT="0" distB="0" distL="114300" distR="114300" simplePos="0" relativeHeight="251739136" behindDoc="1" locked="0" layoutInCell="1" allowOverlap="1" wp14:anchorId="7055ECC5" wp14:editId="6C9BC2D3">
                   <wp:simplePos x="0" y="0"/>
                   <wp:positionH relativeFrom="column">
                     <wp:posOffset>76200</wp:posOffset>
@@ -6672,13 +6718,23 @@
                 <w:lang w:eastAsia="en-US"/>
               </w:rPr>
             </w:pPr>
+            <w:proofErr w:type="gramStart"/>
             <w:r>
               <w:rPr>
                 <w:rFonts w:eastAsiaTheme="minorEastAsia"/>
                 <w:szCs w:val="22"/>
                 <w:lang w:eastAsia="en-US"/>
               </w:rPr>
-              <w:t>The majority of the development meets BESS IEQ requirements.</w:t>
+              <w:t>The majority of</w:t>
+            </w:r>
+            <w:proofErr w:type="gramEnd"/>
+            <w:r>
+              <w:rPr>
+                <w:rFonts w:eastAsiaTheme="minorEastAsia"/>
+                <w:szCs w:val="22"/>
+                <w:lang w:eastAsia="en-US"/>
+              </w:rPr>
+              <w:t xml:space="preserve"> the development meets BESS IEQ requirements.</w:t>
             </w:r>
           </w:p>
         </w:tc>
@@ -7591,7 +7647,7 @@
                 <w:color w:val="000000"/>
               </w:rPr>
               <w:drawing>
-                <wp:anchor distT="0" distB="0" distL="114300" distR="114300" simplePos="0" relativeHeight="251741184" behindDoc="1" locked="0" layoutInCell="1" allowOverlap="1" wp14:anchorId="63206793" wp14:editId="3DF73CA8">
+                <wp:anchor distT="0" distB="0" distL="114300" distR="114300" simplePos="0" relativeHeight="251741184" behindDoc="1" locked="0" layoutInCell="1" allowOverlap="1" wp14:anchorId="63206793" wp14:editId="337D6516">
                   <wp:simplePos x="0" y="0"/>
                   <wp:positionH relativeFrom="column">
                     <wp:posOffset>91440</wp:posOffset>
@@ -9055,13 +9111,41 @@
               <w:rPr>
                 <w:szCs w:val="22"/>
               </w:rPr>
-              <w:t xml:space="preserve"> [XX]</w:t>
-            </w:r>
-            <w:r>
-              <w:rPr>
-                <w:szCs w:val="22"/>
-              </w:rPr>
-              <w:t xml:space="preserve"> litre rainwater tank. XX WC’s are to be connected to the rainwater tank.</w:t>
+              <w:t xml:space="preserve"> </w:t>
+            </w:r>
+            <w:proofErr w:type="gramStart"/>
+            <w:r>
+              <w:rPr>
+                <w:szCs w:val="22"/>
+              </w:rPr>
+              <w:t>[XX]</w:t>
+            </w:r>
+            <w:r>
+              <w:rPr>
+                <w:szCs w:val="22"/>
+              </w:rPr>
+              <w:t xml:space="preserve"> litre</w:t>
+            </w:r>
+            <w:proofErr w:type="gramEnd"/>
+            <w:r>
+              <w:rPr>
+                <w:szCs w:val="22"/>
+              </w:rPr>
+              <w:t xml:space="preserve"> rainwater tank. XX </w:t>
+            </w:r>
+            <w:proofErr w:type="gramStart"/>
+            <w:r>
+              <w:rPr>
+                <w:szCs w:val="22"/>
+              </w:rPr>
+              <w:t>WC’s</w:t>
+            </w:r>
+            <w:proofErr w:type="gramEnd"/>
+            <w:r>
+              <w:rPr>
+                <w:szCs w:val="22"/>
+              </w:rPr>
+              <w:t xml:space="preserve"> are to be connected to the rainwater tank.</w:t>
             </w:r>
           </w:p>
           <w:p>
@@ -9180,7 +9264,39 @@
                 <w:color w:val="auto"/>
                 <w:szCs w:val="22"/>
               </w:rPr>
-              <w:t>To reduce total potable water use due through the use of efficient fixtures, appliances, and the use of rainwater.</w:t>
+              <w:t xml:space="preserve">To reduce total potable </w:t>
+            </w:r>
+            <w:proofErr w:type="gramStart"/>
+            <w:r>
+              <w:rPr>
+                <w:color w:val="auto"/>
+                <w:szCs w:val="22"/>
+              </w:rPr>
+              <w:t>water</w:t>
+            </w:r>
+            <w:proofErr w:type="gramEnd"/>
+            <w:r>
+              <w:rPr>
+                <w:color w:val="auto"/>
+                <w:szCs w:val="22"/>
+              </w:rPr>
+              <w:t xml:space="preserve"> use due </w:t>
+            </w:r>
+            <w:proofErr w:type="gramStart"/>
+            <w:r>
+              <w:rPr>
+                <w:color w:val="auto"/>
+                <w:szCs w:val="22"/>
+              </w:rPr>
+              <w:t>through the use of</w:t>
+            </w:r>
+            <w:proofErr w:type="gramEnd"/>
+            <w:r>
+              <w:rPr>
+                <w:color w:val="auto"/>
+                <w:szCs w:val="22"/>
+              </w:rPr>
+              <w:t xml:space="preserve"> efficient fixtures, appliances, and the use of rainwater.</w:t>
             </w:r>
           </w:p>
         </w:tc>
@@ -9990,6 +10106,7 @@
             </w:r>
           </w:p>
         </w:tc>
+        <w:bookmarkStart w:id="69" w:name="Landscaping"/>
         <w:tc>
           <w:tcPr>
             <w:tcW w:w="6236" w:type="dxa"/>
@@ -10009,15 +10126,35 @@
                 <w:szCs w:val="22"/>
               </w:rPr>
             </w:pPr>
-            <w:bookmarkStart w:id="69" w:name="Landscape_Irrigation"/>
-            <w:r>
-              <w:rPr>
-                <w:bCs/>
-                <w:szCs w:val="22"/>
-              </w:rPr>
-              <w:lastRenderedPageBreak/>
-              <w:t>[XX]</w:t>
-            </w:r>
+            <w:sdt>
+              <w:sdtPr>
+                <w:rPr>
+                  <w:b/>
+                  <w:szCs w:val="22"/>
+                </w:rPr>
+                <w:alias w:val="Irrigation"/>
+                <w:tag w:val="Irrigation"/>
+                <w:id w:val="2087878562"/>
+                <w:placeholder>
+                  <w:docPart w:val="9F41AA2BDC594A199CE6F0670E45926C"/>
+                </w:placeholder>
+                <w:showingPlcHdr/>
+                <w:dropDownList>
+                  <w:listItem w:value="Choose an item."/>
+                  <w:listItem w:displayText="The majority of landscaping is to be native vegetation with no irrigation demand after the initial establishment period." w:value="The majority of landscaping is to be native vegetation with no irrigation demand after the initial establishment period."/>
+                  <w:listItem w:displayText="No landscaping provided to the development" w:value="No landscaping provided to the development"/>
+                  <w:listItem w:displayText="Landscape irrigation demand will be connected to the rainwater tank. " w:value="Landscape irrigation demand will be connected to the rainwater tank. "/>
+                </w:dropDownList>
+              </w:sdtPr>
+              <w:sdtContent>
+                <w:r>
+                  <w:rPr>
+                    <w:rStyle w:val="PlaceholderText"/>
+                  </w:rPr>
+                  <w:t>Choose an item.</w:t>
+                </w:r>
+              </w:sdtContent>
+            </w:sdt>
             <w:bookmarkEnd w:id="69"/>
           </w:p>
         </w:tc>
@@ -10113,7 +10250,21 @@
               <w:rPr>
                 <w:szCs w:val="22"/>
               </w:rPr>
-              <w:t xml:space="preserve"> (e.g. hydrant pump test water or SCV annubar test)</w:t>
+              <w:t xml:space="preserve"> (e.g. hydrant pump test water or SCV </w:t>
+            </w:r>
+            <w:proofErr w:type="spellStart"/>
+            <w:r>
+              <w:rPr>
+                <w:szCs w:val="22"/>
+              </w:rPr>
+              <w:t>annubar</w:t>
+            </w:r>
+            <w:proofErr w:type="spellEnd"/>
+            <w:r>
+              <w:rPr>
+                <w:szCs w:val="22"/>
+              </w:rPr>
+              <w:t xml:space="preserve"> test)</w:t>
             </w:r>
             <w:r>
               <w:rPr>
@@ -10442,7 +10593,21 @@
               <w:rPr>
                 <w:szCs w:val="22"/>
               </w:rPr>
-              <w:t xml:space="preserve">The National Construction Code (NCC) Class 2 – Sole Occupancy Unit(s) residential building component is to be designed in accordance with NCC Section J (2022) NatHERS requirements. The residential units must achieve an average </w:t>
+              <w:t xml:space="preserve">The National Construction Code (NCC) Class 2 – Sole Occupancy Unit(s) residential building component is to be designed in accordance with NCC Section J (2022) </w:t>
+            </w:r>
+            <w:proofErr w:type="spellStart"/>
+            <w:r>
+              <w:rPr>
+                <w:szCs w:val="22"/>
+              </w:rPr>
+              <w:t>NatHERS</w:t>
+            </w:r>
+            <w:proofErr w:type="spellEnd"/>
+            <w:r>
+              <w:rPr>
+                <w:szCs w:val="22"/>
+              </w:rPr>
+              <w:t xml:space="preserve"> requirements. The residential units must achieve an average </w:t>
             </w:r>
             <w:bookmarkStart w:id="72" w:name="FR_target"/>
             <w:r>
@@ -12390,6 +12555,7 @@
                     </w:rPr>
                     <w:fldChar w:fldCharType="separate"/>
                   </w:r>
+                  <w:proofErr w:type="gramStart"/>
                   <w:r>
                     <w:rPr>
                       <w:rFonts w:eastAsia="SimSun" w:cs="Calibri"/>
@@ -12411,6 +12577,7 @@
                     </w:rPr>
                     <w:t>%</w:t>
                   </w:r>
+                  <w:proofErr w:type="gramEnd"/>
                   <w:r>
                     <w:rPr>
                       <w:rFonts w:eastAsia="SimSun" w:cs="Calibri"/>
@@ -12485,6 +12652,7 @@
                     </w:rPr>
                     <w:fldChar w:fldCharType="separate"/>
                   </w:r>
+                  <w:proofErr w:type="gramStart"/>
                   <w:r>
                     <w:rPr>
                       <w:rFonts w:eastAsia="SimSun" w:cs="Calibri"/>
@@ -12506,6 +12674,7 @@
                     </w:rPr>
                     <w:t>%</w:t>
                   </w:r>
+                  <w:proofErr w:type="gramEnd"/>
                   <w:r>
                     <w:rPr>
                       <w:rFonts w:eastAsia="SimSun" w:cs="Calibri"/>
@@ -12618,11 +12787,19 @@
               <w:t xml:space="preserve"> </w:t>
             </w:r>
             <w:bookmarkStart w:id="82" w:name="DTS"/>
-            <w:r>
-              <w:rPr>
-                <w:szCs w:val="22"/>
-              </w:rPr>
-              <w:t>The majority of the development complies with the Deemed-to-Satisfy method for IEQ prescribed by BESS.</w:t>
+            <w:proofErr w:type="gramStart"/>
+            <w:r>
+              <w:rPr>
+                <w:szCs w:val="22"/>
+              </w:rPr>
+              <w:t>The majority of</w:t>
+            </w:r>
+            <w:proofErr w:type="gramEnd"/>
+            <w:r>
+              <w:rPr>
+                <w:szCs w:val="22"/>
+              </w:rPr>
+              <w:t xml:space="preserve"> the development complies with the Deemed-to-Satisfy method for IEQ prescribed by BESS.</w:t>
             </w:r>
             <w:bookmarkEnd w:id="82"/>
             <w:r>
@@ -13087,8 +13264,8 @@
                 <w:szCs w:val="22"/>
               </w:rPr>
             </w:pPr>
-            <w:bookmarkStart w:id="85" w:name="Lighting"/>
-            <w:bookmarkStart w:id="86" w:name="Nat_Vent"/>
+            <w:bookmarkStart w:id="85" w:name="Nat_Vent"/>
+            <w:bookmarkStart w:id="86" w:name="Lighting"/>
             <w:r>
               <w:rPr>
                 <w:szCs w:val="22"/>
@@ -13101,26 +13278,26 @@
               </w:rPr>
               <w:t xml:space="preserve">XX% </w:t>
             </w:r>
+            <w:bookmarkEnd w:id="85"/>
+            <w:r>
+              <w:rPr>
+                <w:szCs w:val="22"/>
+              </w:rPr>
+              <w:t>(XX out of XX)</w:t>
+            </w:r>
+            <w:r>
+              <w:rPr>
+                <w:szCs w:val="22"/>
+              </w:rPr>
+              <w:t>]</w:t>
+            </w:r>
+            <w:r>
+              <w:rPr>
+                <w:szCs w:val="22"/>
+              </w:rPr>
+              <w:t xml:space="preserve"> of the development’s apartments are naturally cross-ventilated. Apartments are provided with windows on opposite or adjacent facades or are effective single sided ventilated.</w:t>
+            </w:r>
             <w:bookmarkEnd w:id="86"/>
-            <w:r>
-              <w:rPr>
-                <w:szCs w:val="22"/>
-              </w:rPr>
-              <w:t>(XX out of XX)</w:t>
-            </w:r>
-            <w:r>
-              <w:rPr>
-                <w:szCs w:val="22"/>
-              </w:rPr>
-              <w:t>]</w:t>
-            </w:r>
-            <w:r>
-              <w:rPr>
-                <w:szCs w:val="22"/>
-              </w:rPr>
-              <w:t xml:space="preserve"> of the development’s apartments are naturally cross-ventilated. Apartments are provided with windows on opposite or adjacent facades or are effective single sided ventilated.</w:t>
-            </w:r>
-            <w:bookmarkEnd w:id="85"/>
           </w:p>
           <w:p>
             <w:pPr>
@@ -13140,12 +13317,21 @@
                 <w:lang w:val="fr-FR"/>
               </w:rPr>
             </w:pPr>
+            <w:proofErr w:type="spellStart"/>
             <w:r>
               <w:rPr>
                 <w:szCs w:val="22"/>
                 <w:lang w:val="fr-FR"/>
               </w:rPr>
-              <w:t xml:space="preserve">Refer </w:t>
+              <w:t>Refer</w:t>
+            </w:r>
+            <w:proofErr w:type="spellEnd"/>
+            <w:r>
+              <w:rPr>
+                <w:szCs w:val="22"/>
+                <w:lang w:val="fr-FR"/>
+              </w:rPr>
+              <w:t xml:space="preserve"> </w:t>
             </w:r>
             <w:r>
               <w:fldChar w:fldCharType="begin"/>
@@ -13199,8 +13385,18 @@
                 <w:color w:val="00602B" w:themeColor="text2"/>
                 <w:szCs w:val="22"/>
               </w:rPr>
-              <w:t>Ventilation – Non-Residential</w:t>
-            </w:r>
+              <w:t xml:space="preserve">Ventilation – </w:t>
+            </w:r>
+            <w:proofErr w:type="gramStart"/>
+            <w:r>
+              <w:rPr>
+                <w:rFonts w:ascii="Roboto" w:hAnsi="Roboto"/>
+                <w:color w:val="00602B" w:themeColor="text2"/>
+                <w:szCs w:val="22"/>
+              </w:rPr>
+              <w:t>Non-Residential</w:t>
+            </w:r>
+            <w:proofErr w:type="gramEnd"/>
           </w:p>
         </w:tc>
         <w:tc>
@@ -14117,7 +14313,21 @@
               <w:rPr>
                 <w:szCs w:val="22"/>
               </w:rPr>
-              <w:t xml:space="preserve"> This will provide a ratio of approximately 1 visitor bicycle space for every X apartments.</w:t>
+              <w:t xml:space="preserve"> This will provide a ratio of approximately 1 visitor bicycle space for every X </w:t>
+            </w:r>
+            <w:proofErr w:type="gramStart"/>
+            <w:r>
+              <w:rPr>
+                <w:szCs w:val="22"/>
+              </w:rPr>
+              <w:t>apartments</w:t>
+            </w:r>
+            <w:proofErr w:type="gramEnd"/>
+            <w:r>
+              <w:rPr>
+                <w:szCs w:val="22"/>
+              </w:rPr>
+              <w:t>.</w:t>
             </w:r>
           </w:p>
         </w:tc>
@@ -15079,7 +15289,21 @@
               <w:rPr>
                 <w:szCs w:val="22"/>
               </w:rPr>
-              <w:t xml:space="preserve">Concrete mixes used within the project will seek to reduce Portland cement and aggregate content where deemed appropriate by the structural engineer. </w:t>
+              <w:t xml:space="preserve">Concrete mixes used within the project will seek to reduce Portland cement and aggregate content </w:t>
+            </w:r>
+            <w:proofErr w:type="gramStart"/>
+            <w:r>
+              <w:rPr>
+                <w:szCs w:val="22"/>
+              </w:rPr>
+              <w:t>where</w:t>
+            </w:r>
+            <w:proofErr w:type="gramEnd"/>
+            <w:r>
+              <w:rPr>
+                <w:szCs w:val="22"/>
+              </w:rPr>
+              <w:t xml:space="preserve"> deemed appropriate by the structural engineer. </w:t>
             </w:r>
           </w:p>
           <w:p>
@@ -15526,7 +15750,21 @@
               <w:rPr>
                 <w:szCs w:val="22"/>
               </w:rPr>
-              <w:t>The project will incorporate products that meet the transparency and sustainability requirements where deemed appropriate. This includes the following: reused products, recycled content products, environmental product declarations, third party certified and stewardship programs.</w:t>
+              <w:t xml:space="preserve">The project will incorporate products that meet the transparency and sustainability requirements </w:t>
+            </w:r>
+            <w:proofErr w:type="gramStart"/>
+            <w:r>
+              <w:rPr>
+                <w:szCs w:val="22"/>
+              </w:rPr>
+              <w:t>where</w:t>
+            </w:r>
+            <w:proofErr w:type="gramEnd"/>
+            <w:r>
+              <w:rPr>
+                <w:szCs w:val="22"/>
+              </w:rPr>
+              <w:t xml:space="preserve"> deemed appropriate. This includes the following: reused products, recycled content products, environmental product declarations, third party certified and stewardship programs.</w:t>
             </w:r>
           </w:p>
         </w:tc>
@@ -16123,7 +16361,21 @@
                 <w:szCs w:val="22"/>
               </w:rPr>
               <w:br/>
-              <w:t>Each tenancy is to be provided with separate general, recycling and food and organics waste bins. This requirement is to be included in the owners corporation rules or lease agreement.</w:t>
+              <w:t xml:space="preserve">Each tenancy is to be provided with separate general, recycling and food and organics waste bins. This requirement is to be included in the </w:t>
+            </w:r>
+            <w:proofErr w:type="gramStart"/>
+            <w:r>
+              <w:rPr>
+                <w:szCs w:val="22"/>
+              </w:rPr>
+              <w:t>owners</w:t>
+            </w:r>
+            <w:proofErr w:type="gramEnd"/>
+            <w:r>
+              <w:rPr>
+                <w:szCs w:val="22"/>
+              </w:rPr>
+              <w:t xml:space="preserve"> corporation rules or lease agreement.</w:t>
             </w:r>
             <w:r>
               <w:rPr>
@@ -17072,7 +17324,21 @@
               <w:rPr>
                 <w:szCs w:val="22"/>
               </w:rPr>
-              <w:t>Roofs are to have a three year SRI of minimum 60</w:t>
+              <w:t xml:space="preserve">Roofs are to have a </w:t>
+            </w:r>
+            <w:proofErr w:type="gramStart"/>
+            <w:r>
+              <w:rPr>
+                <w:szCs w:val="22"/>
+              </w:rPr>
+              <w:t>three year</w:t>
+            </w:r>
+            <w:proofErr w:type="gramEnd"/>
+            <w:r>
+              <w:rPr>
+                <w:szCs w:val="22"/>
+              </w:rPr>
+              <w:t xml:space="preserve"> SRI of minimum 60</w:t>
             </w:r>
             <w:r>
               <w:rPr>
@@ -17099,7 +17365,21 @@
               <w:rPr>
                 <w:szCs w:val="22"/>
               </w:rPr>
-              <w:t>Unshaded hard-scaping elements are to have a three year SRI of minimum 40.</w:t>
+              <w:t xml:space="preserve">Unshaded hard-scaping elements are to have a </w:t>
+            </w:r>
+            <w:proofErr w:type="gramStart"/>
+            <w:r>
+              <w:rPr>
+                <w:szCs w:val="22"/>
+              </w:rPr>
+              <w:t>three year</w:t>
+            </w:r>
+            <w:proofErr w:type="gramEnd"/>
+            <w:r>
+              <w:rPr>
+                <w:szCs w:val="22"/>
+              </w:rPr>
+              <w:t xml:space="preserve"> SRI of minimum 40.</w:t>
             </w:r>
           </w:p>
         </w:tc>
@@ -17534,7 +17814,21 @@
               <w:rPr>
                 <w:szCs w:val="22"/>
               </w:rPr>
-              <w:t xml:space="preserve">The proposed development will be established with a carbon neutral power agreement between developer, owner’s corporation, and electrical retailer to provide GreenPower for all energy consumed by building (including communal areas, apartments and retail tenancy). It is the intent to maintain this agreement for a minimum of 10 years. </w:t>
+              <w:t xml:space="preserve">The proposed development will be established with a carbon neutral power agreement between developer, owner’s corporation, and electrical retailer to provide </w:t>
+            </w:r>
+            <w:proofErr w:type="spellStart"/>
+            <w:r>
+              <w:rPr>
+                <w:szCs w:val="22"/>
+              </w:rPr>
+              <w:t>GreenPower</w:t>
+            </w:r>
+            <w:proofErr w:type="spellEnd"/>
+            <w:r>
+              <w:rPr>
+                <w:szCs w:val="22"/>
+              </w:rPr>
+              <w:t xml:space="preserve"> for all energy consumed by building (including communal areas, apartments and retail tenancy). It is the intent to maintain this agreement for a minimum of 10 years. </w:t>
             </w:r>
           </w:p>
         </w:tc>
@@ -17851,10 +18145,26 @@
         <w:t>Rainwater is to be collected from XX and directed into the</w:t>
       </w:r>
       <w:r>
-        <w:t xml:space="preserve"> [XX]</w:t>
+        <w:t xml:space="preserve"> </w:t>
+      </w:r>
+      <w:proofErr w:type="gramStart"/>
+      <w:r>
+        <w:t>[XX]</w:t>
       </w:r>
       <w:r>
-        <w:t xml:space="preserve"> litre rainwater tank. XX WC’s are to be connected to the rainwater tank.</w:t>
+        <w:t xml:space="preserve"> litre</w:t>
+      </w:r>
+      <w:proofErr w:type="gramEnd"/>
+      <w:r>
+        <w:t xml:space="preserve"> rainwater tank. XX </w:t>
+      </w:r>
+      <w:proofErr w:type="gramStart"/>
+      <w:r>
+        <w:t>WC’s</w:t>
+      </w:r>
+      <w:proofErr w:type="gramEnd"/>
+      <w:r>
+        <w:t xml:space="preserve"> are to be connected to the rainwater tank.</w:t>
       </w:r>
     </w:p>
     <w:p>
@@ -18506,7 +18816,15 @@
         <w:jc w:val="both"/>
       </w:pPr>
       <w:r>
-        <w:t>Introduction of offsite construction for building elements where deemed appropriate.</w:t>
+        <w:t xml:space="preserve">Introduction of offsite construction for building elements </w:t>
+      </w:r>
+      <w:proofErr w:type="gramStart"/>
+      <w:r>
+        <w:t>where</w:t>
+      </w:r>
+      <w:proofErr w:type="gramEnd"/>
+      <w:r>
+        <w:t xml:space="preserve"> deemed appropriate.</w:t>
       </w:r>
     </w:p>
     <w:p>
@@ -19425,7 +19743,21 @@
               <w:rPr>
                 <w:szCs w:val="22"/>
               </w:rPr>
-              <w:t xml:space="preserve">Clear inflow points of built up sediment, rubbish and leaves.  </w:t>
+              <w:t xml:space="preserve">Clear inflow points of </w:t>
+            </w:r>
+            <w:proofErr w:type="gramStart"/>
+            <w:r>
+              <w:rPr>
+                <w:szCs w:val="22"/>
+              </w:rPr>
+              <w:t>built up</w:t>
+            </w:r>
+            <w:proofErr w:type="gramEnd"/>
+            <w:r>
+              <w:rPr>
+                <w:szCs w:val="22"/>
+              </w:rPr>
+              <w:t xml:space="preserve"> sediment, rubbish and leaves.  </w:t>
             </w:r>
           </w:p>
           <w:p>
@@ -19985,7 +20317,21 @@
         <w:rPr>
           <w:rFonts w:eastAsia="Times New Roman" w:cs="Times New Roman"/>
         </w:rPr>
-        <w:t xml:space="preserve">The National Construction Code (NCC) Class 2 – Sole Occupancy Unit(s) residential building component is to be designed in accordance with NCC Section J (2022) NatHERS requirements. The residential units must achieve an average </w:t>
+        <w:t xml:space="preserve">The National Construction Code (NCC) Class 2 – Sole Occupancy Unit(s) residential building component is to be designed in accordance with NCC Section J (2022) </w:t>
+      </w:r>
+      <w:proofErr w:type="spellStart"/>
+      <w:r>
+        <w:rPr>
+          <w:rFonts w:eastAsia="Times New Roman" w:cs="Times New Roman"/>
+        </w:rPr>
+        <w:t>NatHERS</w:t>
+      </w:r>
+      <w:proofErr w:type="spellEnd"/>
+      <w:r>
+        <w:rPr>
+          <w:rFonts w:eastAsia="Times New Roman" w:cs="Times New Roman"/>
+        </w:rPr>
+        <w:t xml:space="preserve"> requirements. The residential units must achieve an average </w:t>
       </w:r>
       <w:r>
         <w:rPr>
@@ -20421,7 +20767,27 @@
           <w:color w:val="auto"/>
           <w:szCs w:val="22"/>
         </w:rPr>
-        <w:t xml:space="preserve">The apartments are currently achieving a X.X Star average. The below sample ratings demonstrate the developments ability to achieve </w:t>
+        <w:t xml:space="preserve">The apartments are currently achieving a X.X Star average. The below sample ratings demonstrate the </w:t>
+      </w:r>
+      <w:proofErr w:type="gramStart"/>
+      <w:r>
+        <w:rPr>
+          <w:rFonts w:ascii="Roboto Light" w:hAnsi="Roboto Light"/>
+          <w:b w:val="0"/>
+          <w:color w:val="auto"/>
+          <w:szCs w:val="22"/>
+        </w:rPr>
+        <w:t>developments</w:t>
+      </w:r>
+      <w:proofErr w:type="gramEnd"/>
+      <w:r>
+        <w:rPr>
+          <w:rFonts w:ascii="Roboto Light" w:hAnsi="Roboto Light"/>
+          <w:b w:val="0"/>
+          <w:color w:val="auto"/>
+          <w:szCs w:val="22"/>
+        </w:rPr>
+        <w:t xml:space="preserve"> ability to achieve </w:t>
       </w:r>
       <w:r>
         <w:rPr>
@@ -20548,6 +20914,7 @@
                 <w:color w:val="00602B" w:themeColor="accent1"/>
               </w:rPr>
             </w:pPr>
+            <w:proofErr w:type="gramStart"/>
             <w:r>
               <w:rPr>
                 <w:rFonts w:ascii="Roboto" w:hAnsi="Roboto"/>
@@ -20555,6 +20922,7 @@
               </w:rPr>
               <w:t>ACE  Heating</w:t>
             </w:r>
+            <w:proofErr w:type="gramEnd"/>
             <w:r>
               <w:rPr>
                 <w:rFonts w:ascii="Roboto" w:hAnsi="Roboto"/>
@@ -20589,6 +20957,7 @@
                 <w:color w:val="00602B" w:themeColor="accent1"/>
               </w:rPr>
             </w:pPr>
+            <w:proofErr w:type="gramStart"/>
             <w:r>
               <w:rPr>
                 <w:rFonts w:ascii="Roboto" w:hAnsi="Roboto"/>
@@ -20596,6 +20965,7 @@
               </w:rPr>
               <w:t>ACE  Cooling</w:t>
             </w:r>
+            <w:proofErr w:type="gramEnd"/>
             <w:r>
               <w:rPr>
                 <w:rFonts w:ascii="Roboto" w:hAnsi="Roboto"/>
@@ -20630,6 +21000,7 @@
                 <w:color w:val="00602B" w:themeColor="accent1"/>
               </w:rPr>
             </w:pPr>
+            <w:proofErr w:type="gramStart"/>
             <w:r>
               <w:rPr>
                 <w:rFonts w:ascii="Roboto" w:hAnsi="Roboto"/>
@@ -20637,6 +21008,7 @@
               </w:rPr>
               <w:t>ACE  NCFA</w:t>
             </w:r>
+            <w:proofErr w:type="gramEnd"/>
           </w:p>
         </w:tc>
         <w:tc>
@@ -21825,6 +22197,7 @@
                 <w:szCs w:val="22"/>
               </w:rPr>
             </w:pPr>
+            <w:proofErr w:type="gramStart"/>
             <w:r>
               <w:rPr>
                 <w:rFonts w:ascii="Roboto Light" w:hAnsi="Roboto Light"/>
@@ -21833,6 +22206,7 @@
               </w:rPr>
               <w:t>RX.X+RX.X</w:t>
             </w:r>
+            <w:proofErr w:type="gramEnd"/>
           </w:p>
         </w:tc>
       </w:tr>
@@ -22064,16 +22438,26 @@
                 <w:b w:val="0"/>
                 <w:szCs w:val="22"/>
               </w:rPr>
-              <w:t xml:space="preserve"> Argon filled, </w:t>
-            </w:r>
+              <w:t xml:space="preserve"> Argon </w:t>
+            </w:r>
+            <w:proofErr w:type="gramStart"/>
             <w:r>
               <w:rPr>
                 <w:rFonts w:ascii="Roboto Light" w:hAnsi="Roboto Light"/>
                 <w:b w:val="0"/>
                 <w:szCs w:val="22"/>
               </w:rPr>
+              <w:t xml:space="preserve">filled, </w:t>
+            </w:r>
+            <w:r>
+              <w:rPr>
+                <w:rFonts w:ascii="Roboto Light" w:hAnsi="Roboto Light"/>
+                <w:b w:val="0"/>
+                <w:szCs w:val="22"/>
+              </w:rPr>
               <w:t xml:space="preserve"> Clear</w:t>
             </w:r>
+            <w:proofErr w:type="gramEnd"/>
           </w:p>
         </w:tc>
         <w:tc>
@@ -22224,16 +22608,26 @@
                 <w:b w:val="0"/>
                 <w:szCs w:val="22"/>
               </w:rPr>
-              <w:t xml:space="preserve"> Argon filled, </w:t>
-            </w:r>
+              <w:t xml:space="preserve"> Argon </w:t>
+            </w:r>
+            <w:proofErr w:type="gramStart"/>
             <w:r>
               <w:rPr>
                 <w:rFonts w:ascii="Roboto Light" w:hAnsi="Roboto Light"/>
                 <w:b w:val="0"/>
                 <w:szCs w:val="22"/>
               </w:rPr>
+              <w:t xml:space="preserve">filled, </w:t>
+            </w:r>
+            <w:r>
+              <w:rPr>
+                <w:rFonts w:ascii="Roboto Light" w:hAnsi="Roboto Light"/>
+                <w:b w:val="0"/>
+                <w:szCs w:val="22"/>
+              </w:rPr>
               <w:t xml:space="preserve"> Clear</w:t>
             </w:r>
+            <w:proofErr w:type="gramEnd"/>
           </w:p>
         </w:tc>
         <w:tc>
@@ -22425,6 +22819,7 @@
       <w:pPr>
         <w:pStyle w:val="Heading3"/>
       </w:pPr>
+      <w:proofErr w:type="spellStart"/>
       <w:r>
         <w:rPr>
           <w:highlight w:val="yellow"/>
@@ -22441,7 +22836,14 @@
         <w:rPr>
           <w:highlight w:val="yellow"/>
         </w:rPr>
-        <w:t>atts Calculator</w:t>
+        <w:t>atts</w:t>
+      </w:r>
+      <w:proofErr w:type="spellEnd"/>
+      <w:r>
+        <w:rPr>
+          <w:highlight w:val="yellow"/>
+        </w:rPr>
+        <w:t xml:space="preserve"> Calculator</w:t>
       </w:r>
       <w:r>
         <w:br w:type="page"/>
@@ -33036,6 +33438,35 @@
         </w:p>
       </w:docPartBody>
     </w:docPart>
+    <w:docPart>
+      <w:docPartPr>
+        <w:name w:val="9F41AA2BDC594A199CE6F0670E45926C"/>
+        <w:category>
+          <w:name w:val="General"/>
+          <w:gallery w:val="placeholder"/>
+        </w:category>
+        <w:types>
+          <w:type w:val="bbPlcHdr"/>
+        </w:types>
+        <w:behaviors>
+          <w:behavior w:val="content"/>
+        </w:behaviors>
+        <w:guid w:val="{9B99D766-6013-4AA6-B42A-86C4A1C408FB}"/>
+      </w:docPartPr>
+      <w:docPartBody>
+        <w:p>
+          <w:pPr>
+            <w:pStyle w:val="9F41AA2BDC594A199CE6F0670E45926C"/>
+          </w:pPr>
+          <w:r>
+            <w:rPr>
+              <w:rStyle w:val="PlaceholderText"/>
+            </w:rPr>
+            <w:t>Choose an item.</w:t>
+          </w:r>
+        </w:p>
+      </w:docPartBody>
+    </w:docPart>
   </w:docParts>
 </w:glossaryDocument>
 </file>
@@ -33533,6 +33964,7 @@
     <w:rsid w:val="0041699F"/>
     <w:rsid w:val="00442A7F"/>
     <w:rsid w:val="0045519A"/>
+    <w:rsid w:val="004556FE"/>
     <w:rsid w:val="004558F6"/>
     <w:rsid w:val="00460782"/>
     <w:rsid w:val="004D7895"/>
@@ -33582,6 +34014,8 @@
     <w:rsid w:val="008F56B5"/>
     <w:rsid w:val="00910B2C"/>
     <w:rsid w:val="00916303"/>
+    <w:rsid w:val="0093443B"/>
+    <w:rsid w:val="00946496"/>
     <w:rsid w:val="0095765B"/>
     <w:rsid w:val="0096582F"/>
     <w:rsid w:val="00975BDB"/>
@@ -34099,7 +34533,7 @@
     <w:basedOn w:val="DefaultParagraphFont"/>
     <w:uiPriority w:val="99"/>
     <w:semiHidden/>
-    <w:rsid w:val="000237AA"/>
+    <w:rsid w:val="0093443B"/>
     <w:rPr>
       <w:color w:val="808080"/>
     </w:rPr>
@@ -34313,6 +34747,20 @@
   <w:style w:type="paragraph" w:customStyle="1" w:styleId="7FFC764F1F714EAF90EDBC9B656436E4">
     <w:name w:val="7FFC764F1F714EAF90EDBC9B656436E4"/>
     <w:rsid w:val="000237AA"/>
+    <w:pPr>
+      <w:spacing w:after="160" w:line="278" w:lineRule="auto"/>
+    </w:pPr>
+    <w:rPr>
+      <w:kern w:val="2"/>
+      <w:sz w:val="24"/>
+      <w:szCs w:val="24"/>
+      <w:lang w:val="en-CA" w:eastAsia="zh-CN"/>
+      <w14:ligatures w14:val="standardContextual"/>
+    </w:rPr>
+  </w:style>
+  <w:style w:type="paragraph" w:customStyle="1" w:styleId="9F41AA2BDC594A199CE6F0670E45926C">
+    <w:name w:val="9F41AA2BDC594A199CE6F0670E45926C"/>
+    <w:rsid w:val="0093443B"/>
     <w:pPr>
       <w:spacing w:after="160" w:line="278" w:lineRule="auto"/>
     </w:pPr>

</xml_diff>

<commit_message>
Sync root template copies with updated server/templates versions
Co-Authored-By: Claude Sonnet 4.6 <noreply@anthropic.com>
</commit_message>
<xml_diff>
--- a/DATE-GIWREF-Address-SMP-MixUse-2022-A.docx
+++ b/DATE-GIWREF-Address-SMP-MixUse-2022-A.docx
@@ -97,6 +97,15 @@
               <w:rPr>
                 <w:rFonts w:ascii="Roboto" w:eastAsia="Roboto" w:hAnsi="Roboto" w:cs="Roboto"/>
                 <w:color w:val="FFFFFF"/>
+                <w:sz w:val="20"/>
+                <w:lang w:val="en-US"/>
+              </w:rPr>
+              <w:t>ed</w:t>
+            </w:r>
+            <w:r>
+              <w:rPr>
+                <w:rFonts w:ascii="Roboto" w:eastAsia="Roboto" w:hAnsi="Roboto" w:cs="Roboto"/>
+                <w:color w:val="FFFFFF"/>
                 <w:spacing w:val="-4"/>
                 <w:sz w:val="20"/>
                 <w:lang w:val="en-US"/>
@@ -224,7 +233,7 @@
                 <w:sz w:val="20"/>
                 <w:lang w:val="en-US"/>
               </w:rPr>
-              <w:t>19 June 2026</w:t>
+              <w:t>22 June 2026</w:t>
             </w:r>
             <w:r>
               <w:rPr>
@@ -1493,7 +1502,6 @@
               </w:rPr>
               <w:br/>
             </w:r>
-            <w:proofErr w:type="spellStart"/>
             <w:r>
               <w:rPr>
                 <w:b/>
@@ -1503,7 +1511,6 @@
               </w:rPr>
               <w:t>Firstname</w:t>
             </w:r>
-            <w:proofErr w:type="spellEnd"/>
             <w:r>
               <w:rPr>
                 <w:b/>
@@ -3648,7 +3655,7 @@
         <w:t>[</w:t>
       </w:r>
       <w:r>
-        <w:t>XX</w:t>
+        <w:t>total apartments</w:t>
       </w:r>
       <w:r>
         <w:t>]</w:t>
@@ -3660,7 +3667,7 @@
         <w:t>[</w:t>
       </w:r>
       <w:r>
-        <w:t>XX</w:t>
+        <w:t>total retail</w:t>
       </w:r>
       <w:r>
         <w:t>]</w:t>
@@ -3672,7 +3679,7 @@
         <w:t>[</w:t>
       </w:r>
       <w:r>
-        <w:t>XX</w:t>
+        <w:t>total office</w:t>
       </w:r>
       <w:r>
         <w:t>]</w:t>
@@ -3684,7 +3691,7 @@
         <w:t>[</w:t>
       </w:r>
       <w:r>
-        <w:t>XX</w:t>
+        <w:t>building height</w:t>
       </w:r>
       <w:r>
         <w:t>]</w:t>
@@ -3731,24 +3738,11 @@
       <w:r>
         <w:t>XX</w:t>
       </w:r>
-      <w:proofErr w:type="gramStart"/>
       <w:r>
         <w:t>]</w:t>
       </w:r>
       <w:r>
-        <w:t xml:space="preserve">  x</w:t>
-      </w:r>
-      <w:proofErr w:type="gramEnd"/>
-      <w:r>
-        <w:t xml:space="preserve"> </w:t>
-      </w:r>
-      <w:proofErr w:type="gramStart"/>
-      <w:r>
-        <w:t>1 bedroom</w:t>
-      </w:r>
-      <w:proofErr w:type="gramEnd"/>
-      <w:r>
-        <w:t xml:space="preserve"> apartments</w:t>
+        <w:t xml:space="preserve">  x 1 bedroom apartments</w:t>
       </w:r>
     </w:p>
     <w:p>
@@ -3770,15 +3764,7 @@
         <w:t>]</w:t>
       </w:r>
       <w:r>
-        <w:t xml:space="preserve"> x </w:t>
-      </w:r>
-      <w:proofErr w:type="gramStart"/>
-      <w:r>
-        <w:t>2 bedroom</w:t>
-      </w:r>
-      <w:proofErr w:type="gramEnd"/>
-      <w:r>
-        <w:t xml:space="preserve"> apartments</w:t>
+        <w:t xml:space="preserve"> x 2 bedroom apartments</w:t>
       </w:r>
     </w:p>
     <w:p>
@@ -3800,15 +3786,7 @@
         <w:t>]</w:t>
       </w:r>
       <w:r>
-        <w:t xml:space="preserve"> x </w:t>
-      </w:r>
-      <w:proofErr w:type="gramStart"/>
-      <w:r>
-        <w:t>3 bedroom</w:t>
-      </w:r>
-      <w:proofErr w:type="gramEnd"/>
-      <w:r>
-        <w:t xml:space="preserve"> apartments</w:t>
+        <w:t xml:space="preserve"> x 3 bedroom apartments</w:t>
       </w:r>
     </w:p>
     <w:p>
@@ -3824,7 +3802,7 @@
         <w:t>[</w:t>
       </w:r>
       <w:r>
-        <w:t>XX</w:t>
+        <w:t>total area retail</w:t>
       </w:r>
       <w:r>
         <w:t>]</w:t>
@@ -3855,7 +3833,7 @@
         <w:t>[</w:t>
       </w:r>
       <w:r>
-        <w:t>XX</w:t>
+        <w:t>total area office</w:t>
       </w:r>
       <w:r>
         <w:t>]</w:t>
@@ -3884,7 +3862,7 @@
         <w:t>[</w:t>
       </w:r>
       <w:r>
-        <w:t>XX</w:t>
+        <w:t>site area</w:t>
       </w:r>
       <w:r>
         <w:t>]</w:t>
@@ -3905,7 +3883,7 @@
         <w:t>[</w:t>
       </w:r>
       <w:r>
-        <w:t>XX</w:t>
+        <w:t>distance to CBD</w:t>
       </w:r>
       <w:r>
         <w:t>]</w:t>
@@ -3993,13 +3971,8 @@
       <w:r>
         <w:t xml:space="preserve"> - </w:t>
       </w:r>
-      <w:proofErr w:type="gramStart"/>
       <w:r>
-        <w:t>Pre-existing</w:t>
-      </w:r>
-      <w:proofErr w:type="gramEnd"/>
-      <w:r>
-        <w:t xml:space="preserve"> sites at </w:t>
+        <w:t xml:space="preserve">Pre-existing sites at </w:t>
       </w:r>
       <w:sdt>
         <w:sdtPr>
@@ -5756,7 +5729,7 @@
                 <w:sz w:val="24"/>
                 <w:szCs w:val="24"/>
               </w:rPr>
-              <w:t>XX</w:t>
+              <w:t>BESS score</w:t>
             </w:r>
             <w:r>
               <w:rPr>
@@ -6163,7 +6136,7 @@
                 <w:color w:val="000000"/>
               </w:rPr>
               <w:drawing>
-                <wp:anchor distT="0" distB="0" distL="114300" distR="114300" simplePos="0" relativeHeight="251738112" behindDoc="1" locked="0" layoutInCell="1" allowOverlap="1" wp14:anchorId="22787630" wp14:editId="2E8DFD95">
+                <wp:anchor distT="0" distB="0" distL="114300" distR="114300" simplePos="0" relativeHeight="251738112" behindDoc="1" locked="0" layoutInCell="1" allowOverlap="1" wp14:anchorId="22787630" wp14:editId="476CD378">
                   <wp:simplePos x="0" y="0"/>
                   <wp:positionH relativeFrom="column">
                     <wp:posOffset>77470</wp:posOffset>
@@ -6289,23 +6262,13 @@
             <w:r>
               <w:fldChar w:fldCharType="end"/>
             </w:r>
-            <w:proofErr w:type="spellStart"/>
             <w:r>
               <w:rPr>
                 <w:rFonts w:eastAsiaTheme="minorEastAsia"/>
                 <w:szCs w:val="22"/>
                 <w:lang w:eastAsia="en-US"/>
               </w:rPr>
-              <w:t>NatHERS</w:t>
-            </w:r>
-            <w:proofErr w:type="spellEnd"/>
-            <w:r>
-              <w:rPr>
-                <w:rFonts w:eastAsiaTheme="minorEastAsia"/>
-                <w:szCs w:val="22"/>
-                <w:lang w:eastAsia="en-US"/>
-              </w:rPr>
-              <w:t xml:space="preserve"> Energy Rating.</w:t>
+              <w:t>NatHERS Energy Rating.</w:t>
             </w:r>
           </w:p>
         </w:tc>
@@ -6636,7 +6599,7 @@
                 <w:color w:val="000000"/>
               </w:rPr>
               <w:drawing>
-                <wp:anchor distT="0" distB="0" distL="114300" distR="114300" simplePos="0" relativeHeight="251739136" behindDoc="1" locked="0" layoutInCell="1" allowOverlap="1" wp14:anchorId="7055ECC5" wp14:editId="6C9BC2D3">
+                <wp:anchor distT="0" distB="0" distL="114300" distR="114300" simplePos="0" relativeHeight="251739136" behindDoc="1" locked="0" layoutInCell="1" allowOverlap="1" wp14:anchorId="7055ECC5" wp14:editId="29C6B725">
                   <wp:simplePos x="0" y="0"/>
                   <wp:positionH relativeFrom="column">
                     <wp:posOffset>76200</wp:posOffset>
@@ -6718,23 +6681,13 @@
                 <w:lang w:eastAsia="en-US"/>
               </w:rPr>
             </w:pPr>
-            <w:proofErr w:type="gramStart"/>
             <w:r>
               <w:rPr>
                 <w:rFonts w:eastAsiaTheme="minorEastAsia"/>
                 <w:szCs w:val="22"/>
                 <w:lang w:eastAsia="en-US"/>
               </w:rPr>
-              <w:t>The majority of</w:t>
-            </w:r>
-            <w:proofErr w:type="gramEnd"/>
-            <w:r>
-              <w:rPr>
-                <w:rFonts w:eastAsiaTheme="minorEastAsia"/>
-                <w:szCs w:val="22"/>
-                <w:lang w:eastAsia="en-US"/>
-              </w:rPr>
-              <w:t xml:space="preserve"> the development meets BESS IEQ requirements.</w:t>
+              <w:t>The majority of the development meets BESS IEQ requirements.</w:t>
             </w:r>
           </w:p>
         </w:tc>
@@ -7647,7 +7600,7 @@
                 <w:color w:val="000000"/>
               </w:rPr>
               <w:drawing>
-                <wp:anchor distT="0" distB="0" distL="114300" distR="114300" simplePos="0" relativeHeight="251741184" behindDoc="1" locked="0" layoutInCell="1" allowOverlap="1" wp14:anchorId="63206793" wp14:editId="337D6516">
+                <wp:anchor distT="0" distB="0" distL="114300" distR="114300" simplePos="0" relativeHeight="251741184" behindDoc="1" locked="0" layoutInCell="1" allowOverlap="1" wp14:anchorId="63206793" wp14:editId="5352C7C5">
                   <wp:simplePos x="0" y="0"/>
                   <wp:positionH relativeFrom="column">
                     <wp:posOffset>91440</wp:posOffset>
@@ -8613,36 +8566,46 @@
             <w:pPr>
               <w:spacing w:before="0" w:after="0" w:line="240" w:lineRule="auto"/>
               <w:jc w:val="both"/>
-              <w:rPr>
-                <w:szCs w:val="22"/>
-              </w:rPr>
-            </w:pPr>
-            <w:bookmarkStart w:id="63" w:name="Metering"/>
-            <w:r>
-              <w:rPr>
-                <w:szCs w:val="22"/>
-              </w:rPr>
-              <w:t>Electricity, cold water, hot water or gas metering is to be provided to each individual apartment and commercial tenancy.</w:t>
-            </w:r>
-            <w:bookmarkEnd w:id="63"/>
-            <w:r>
-              <w:rPr>
-                <w:szCs w:val="22"/>
-              </w:rPr>
-              <w:t xml:space="preserve"> </w:t>
-            </w:r>
-            <w:r>
-              <w:rPr>
-                <w:szCs w:val="22"/>
-              </w:rPr>
-              <w:br/>
-            </w:r>
-            <w:r>
-              <w:rPr>
-                <w:szCs w:val="22"/>
-              </w:rPr>
-              <w:br/>
-            </w:r>
+            </w:pPr>
+            <w:r>
+              <w:t xml:space="preserve">Electricity and cold water metering is to be provided to each individual apartment and commercial tenancy. </w:t>
+            </w:r>
+          </w:p>
+          <w:p>
+            <w:pPr>
+              <w:spacing w:before="0" w:after="0" w:line="240" w:lineRule="auto"/>
+              <w:jc w:val="both"/>
+            </w:pPr>
+          </w:p>
+          <w:p>
+            <w:pPr>
+              <w:spacing w:before="0" w:after="0" w:line="240" w:lineRule="auto"/>
+              <w:jc w:val="both"/>
+              <w:rPr>
+                <w:szCs w:val="22"/>
+              </w:rPr>
+            </w:pPr>
+            <w:r>
+              <w:t xml:space="preserve">Gas metering is to be provided to the commercial tenancy. </w:t>
+            </w:r>
+          </w:p>
+          <w:p>
+            <w:pPr>
+              <w:spacing w:before="0" w:after="0" w:line="240" w:lineRule="auto"/>
+              <w:jc w:val="both"/>
+              <w:rPr>
+                <w:szCs w:val="22"/>
+              </w:rPr>
+            </w:pPr>
+          </w:p>
+          <w:p>
+            <w:pPr>
+              <w:spacing w:before="0" w:after="0" w:line="240" w:lineRule="auto"/>
+              <w:jc w:val="both"/>
+              <w:rPr>
+                <w:szCs w:val="22"/>
+              </w:rPr>
+            </w:pPr>
             <w:r>
               <w:rPr>
                 <w:szCs w:val="22"/>
@@ -8773,7 +8736,7 @@
       </w:tr>
     </w:tbl>
     <w:p>
-      <w:bookmarkStart w:id="64" w:name="_Toc46738705"/>
+      <w:bookmarkStart w:id="63" w:name="_Toc46738705"/>
     </w:p>
     <w:p>
       <w:pPr>
@@ -8799,13 +8762,13 @@
           <w:kern w:val="32"/>
         </w:rPr>
       </w:pPr>
-      <w:bookmarkStart w:id="65" w:name="_Toc231555526"/>
+      <w:bookmarkStart w:id="64" w:name="_Toc231555526"/>
       <w:r>
         <w:lastRenderedPageBreak/>
         <w:t>Integrated Water Management</w:t>
       </w:r>
+      <w:bookmarkEnd w:id="63"/>
       <w:bookmarkEnd w:id="64"/>
-      <w:bookmarkEnd w:id="65"/>
     </w:p>
     <w:p>
       <w:pPr>
@@ -9060,7 +9023,7 @@
                 <w:szCs w:val="22"/>
               </w:rPr>
             </w:pPr>
-            <w:bookmarkStart w:id="66" w:name="BlueFactor"/>
+            <w:bookmarkStart w:id="65" w:name="BlueFactor"/>
             <w:r>
               <w:rPr>
                 <w:color w:val="auto"/>
@@ -9073,7 +9036,7 @@
                 <w:color w:val="auto"/>
                 <w:szCs w:val="22"/>
               </w:rPr>
-              <w:t>100</w:t>
+              <w:t>[Blue Factor score]</w:t>
             </w:r>
             <w:r>
               <w:rPr>
@@ -9082,7 +9045,7 @@
               </w:rPr>
               <w:t>% is achieved</w:t>
             </w:r>
-            <w:bookmarkEnd w:id="66"/>
+            <w:bookmarkEnd w:id="65"/>
             <w:r>
               <w:rPr>
                 <w:color w:val="auto"/>
@@ -9100,52 +9063,48 @@
                 <w:szCs w:val="22"/>
               </w:rPr>
             </w:pPr>
-            <w:bookmarkStart w:id="67" w:name="WSUD_Strat"/>
-            <w:r>
-              <w:rPr>
-                <w:szCs w:val="22"/>
-              </w:rPr>
-              <w:t>Rainwater is to be collected from XX and directed into the</w:t>
-            </w:r>
-            <w:r>
-              <w:rPr>
-                <w:szCs w:val="22"/>
-              </w:rPr>
-              <w:t xml:space="preserve"> </w:t>
-            </w:r>
-            <w:proofErr w:type="gramStart"/>
-            <w:r>
-              <w:rPr>
-                <w:szCs w:val="22"/>
-              </w:rPr>
-              <w:t>[XX]</w:t>
-            </w:r>
-            <w:r>
-              <w:rPr>
-                <w:szCs w:val="22"/>
-              </w:rPr>
-              <w:t xml:space="preserve"> litre</w:t>
-            </w:r>
-            <w:proofErr w:type="gramEnd"/>
-            <w:r>
-              <w:rPr>
-                <w:szCs w:val="22"/>
-              </w:rPr>
-              <w:t xml:space="preserve"> rainwater tank. XX </w:t>
-            </w:r>
-            <w:proofErr w:type="gramStart"/>
-            <w:r>
-              <w:rPr>
-                <w:szCs w:val="22"/>
-              </w:rPr>
-              <w:t>WC’s</w:t>
-            </w:r>
-            <w:proofErr w:type="gramEnd"/>
-            <w:r>
-              <w:rPr>
-                <w:szCs w:val="22"/>
-              </w:rPr>
-              <w:t xml:space="preserve"> are to be connected to the rainwater tank.</w:t>
+            <w:bookmarkStart w:id="66" w:name="WSUD_Strat"/>
+            <w:r>
+              <w:rPr>
+                <w:szCs w:val="22"/>
+              </w:rPr>
+              <w:t xml:space="preserve">Rainwater is to be collected from </w:t>
+            </w:r>
+            <w:r>
+              <w:rPr>
+                <w:szCs w:val="22"/>
+              </w:rPr>
+              <w:t>[collection area]m2</w:t>
+            </w:r>
+            <w:r>
+              <w:rPr>
+                <w:szCs w:val="22"/>
+              </w:rPr>
+              <w:t xml:space="preserve"> and directed into the</w:t>
+            </w:r>
+            <w:r>
+              <w:rPr>
+                <w:szCs w:val="22"/>
+              </w:rPr>
+              <w:t xml:space="preserve"> [</w:t>
+            </w:r>
+            <w:r>
+              <w:rPr>
+                <w:szCs w:val="22"/>
+              </w:rPr>
+              <w:t>rainwater tank size</w:t>
+            </w:r>
+            <w:r>
+              <w:rPr>
+                <w:szCs w:val="22"/>
+              </w:rPr>
+              <w:t>]</w:t>
+            </w:r>
+            <w:r>
+              <w:rPr>
+                <w:szCs w:val="22"/>
+              </w:rPr>
+              <w:t xml:space="preserve"> litre rainwater tank. XX WC’s are to be connected to the rainwater tank.</w:t>
             </w:r>
           </w:p>
           <w:p>
@@ -9161,10 +9120,22 @@
               <w:rPr>
                 <w:szCs w:val="22"/>
               </w:rPr>
-              <w:t>Rainwater is to be collected from XX and directed into a ≥XXm2, minimum 1,150mm deep raingarden with 300mm of extended detention.</w:t>
-            </w:r>
-          </w:p>
-          <w:bookmarkEnd w:id="67"/>
+              <w:t>Rainwater is to be collected from XX and directed into a ≥</w:t>
+            </w:r>
+            <w:r>
+              <w:rPr>
+                <w:szCs w:val="22"/>
+              </w:rPr>
+              <w:t>[raingarden size]</w:t>
+            </w:r>
+            <w:r>
+              <w:rPr>
+                <w:szCs w:val="22"/>
+              </w:rPr>
+              <w:t>m2, minimum 1,150mm deep raingarden with 300mm of extended detention.</w:t>
+            </w:r>
+          </w:p>
+          <w:bookmarkEnd w:id="66"/>
           <w:p>
             <w:pPr>
               <w:spacing w:before="0" w:after="0" w:line="240" w:lineRule="auto"/>
@@ -9264,39 +9235,7 @@
                 <w:color w:val="auto"/>
                 <w:szCs w:val="22"/>
               </w:rPr>
-              <w:t xml:space="preserve">To reduce total potable </w:t>
-            </w:r>
-            <w:proofErr w:type="gramStart"/>
-            <w:r>
-              <w:rPr>
-                <w:color w:val="auto"/>
-                <w:szCs w:val="22"/>
-              </w:rPr>
-              <w:t>water</w:t>
-            </w:r>
-            <w:proofErr w:type="gramEnd"/>
-            <w:r>
-              <w:rPr>
-                <w:color w:val="auto"/>
-                <w:szCs w:val="22"/>
-              </w:rPr>
-              <w:t xml:space="preserve"> use due </w:t>
-            </w:r>
-            <w:proofErr w:type="gramStart"/>
-            <w:r>
-              <w:rPr>
-                <w:color w:val="auto"/>
-                <w:szCs w:val="22"/>
-              </w:rPr>
-              <w:t>through the use of</w:t>
-            </w:r>
-            <w:proofErr w:type="gramEnd"/>
-            <w:r>
-              <w:rPr>
-                <w:color w:val="auto"/>
-                <w:szCs w:val="22"/>
-              </w:rPr>
-              <w:t xml:space="preserve"> efficient fixtures, appliances, and the use of rainwater.</w:t>
+              <w:t>To reduce total potable water use due through the use of efficient fixtures, appliances, and the use of rainwater.</w:t>
             </w:r>
           </w:p>
         </w:tc>
@@ -9348,12 +9287,14 @@
                     <w:rPr>
                       <w:noProof/>
                       <w:szCs w:val="22"/>
+                      <w:lang w:val="fr-FR"/>
                     </w:rPr>
                   </w:pPr>
                   <w:r>
                     <w:rPr>
                       <w:noProof/>
                       <w:szCs w:val="22"/>
+                      <w:lang w:val="fr-FR"/>
                     </w:rPr>
                     <w:t xml:space="preserve">WELS </w:t>
                   </w:r>
@@ -9361,6 +9302,7 @@
                     <w:rPr>
                       <w:noProof/>
                       <w:szCs w:val="22"/>
+                      <w:lang w:val="fr-FR"/>
                     </w:rPr>
                     <w:t>[</w:t>
                   </w:r>
@@ -9368,13 +9310,15 @@
                     <w:rPr>
                       <w:noProof/>
                       <w:szCs w:val="22"/>
+                      <w:lang w:val="fr-FR"/>
                     </w:rPr>
-                    <w:t>4</w:t>
+                    <w:t>toilet WELS</w:t>
                   </w:r>
                   <w:r>
                     <w:rPr>
                       <w:noProof/>
                       <w:szCs w:val="22"/>
+                      <w:lang w:val="fr-FR"/>
                     </w:rPr>
                     <w:t>]</w:t>
                   </w:r>
@@ -9382,6 +9326,7 @@
                     <w:rPr>
                       <w:noProof/>
                       <w:szCs w:val="22"/>
+                      <w:lang w:val="fr-FR"/>
                     </w:rPr>
                     <w:t xml:space="preserve"> Star - Toilets</w:t>
                   </w:r>
@@ -9419,7 +9364,7 @@
                       <w:noProof/>
                       <w:szCs w:val="22"/>
                     </w:rPr>
-                    <w:t>5</w:t>
+                    <w:t>taps WELS</w:t>
                   </w:r>
                   <w:r>
                     <w:rPr>
@@ -9468,14 +9413,7 @@
                       <w:noProof/>
                       <w:szCs w:val="22"/>
                     </w:rPr>
-                    <w:t>[</w:t>
-                  </w:r>
-                  <w:r>
-                    <w:rPr>
-                      <w:noProof/>
-                      <w:szCs w:val="22"/>
-                    </w:rPr>
-                    <w:t>4</w:t>
+                    <w:t>[shower WELS</w:t>
                   </w:r>
                   <w:r>
                     <w:rPr>
@@ -9531,7 +9469,7 @@
                       <w:noProof/>
                       <w:szCs w:val="22"/>
                     </w:rPr>
-                    <w:t>5</w:t>
+                    <w:t>Dishwasher WELS</w:t>
                   </w:r>
                   <w:r>
                     <w:rPr>
@@ -9920,7 +9858,7 @@
                 <w:szCs w:val="22"/>
               </w:rPr>
             </w:pPr>
-            <w:bookmarkStart w:id="68" w:name="Rainwater_tank"/>
+            <w:bookmarkStart w:id="67" w:name="Rainwater_tank"/>
             <w:r>
               <w:rPr>
                 <w:szCs w:val="22"/>
@@ -9943,7 +9881,7 @@
               <w:rPr>
                 <w:szCs w:val="22"/>
               </w:rPr>
-              <w:t>XXX</w:t>
+              <w:t>rainwater tank size</w:t>
             </w:r>
             <w:r>
               <w:rPr>
@@ -9961,9 +9899,15 @@
               <w:rPr>
                 <w:szCs w:val="22"/>
               </w:rPr>
-              <w:t>litre rainwater tank will harvest rainwater from XXX</w:t>
-            </w:r>
-            <w:bookmarkEnd w:id="68"/>
+              <w:t xml:space="preserve">litre rainwater tank will harvest rainwater from </w:t>
+            </w:r>
+            <w:bookmarkEnd w:id="67"/>
+            <w:r>
+              <w:rPr>
+                <w:szCs w:val="22"/>
+              </w:rPr>
+              <w:t>[collection area]</w:t>
+            </w:r>
             <w:r>
               <w:rPr>
                 <w:szCs w:val="22"/>
@@ -10094,7 +10038,7 @@
                 <w:color w:val="auto"/>
                 <w:szCs w:val="22"/>
               </w:rPr>
-              <w:t xml:space="preserve">To ensure the efficient use of water and to reduce total operating potable water use through encouraging water efficient </w:t>
+              <w:t xml:space="preserve">To ensure the efficient use of water and to reduce total operating potable water use through </w:t>
             </w:r>
             <w:r>
               <w:rPr>
@@ -10102,11 +10046,11 @@
                 <w:szCs w:val="22"/>
               </w:rPr>
               <w:lastRenderedPageBreak/>
-              <w:t>landscape design.</w:t>
-            </w:r>
-          </w:p>
-        </w:tc>
-        <w:bookmarkStart w:id="69" w:name="Landscaping"/>
+              <w:t>encouraging water efficient landscape design.</w:t>
+            </w:r>
+          </w:p>
+        </w:tc>
+        <w:bookmarkStart w:id="68" w:name="Landscaping"/>
         <w:tc>
           <w:tcPr>
             <w:tcW w:w="6236" w:type="dxa"/>
@@ -10130,7 +10074,6 @@
               <w:sdtPr>
                 <w:rPr>
                   <w:b/>
-                  <w:szCs w:val="22"/>
                 </w:rPr>
                 <w:alias w:val="Irrigation"/>
                 <w:tag w:val="Irrigation"/>
@@ -10155,7 +10098,7 @@
                 </w:r>
               </w:sdtContent>
             </w:sdt>
-            <w:bookmarkEnd w:id="69"/>
+            <w:bookmarkEnd w:id="68"/>
           </w:p>
         </w:tc>
       </w:tr>
@@ -10250,21 +10193,7 @@
               <w:rPr>
                 <w:szCs w:val="22"/>
               </w:rPr>
-              <w:t xml:space="preserve"> (e.g. hydrant pump test water or SCV </w:t>
-            </w:r>
-            <w:proofErr w:type="spellStart"/>
-            <w:r>
-              <w:rPr>
-                <w:szCs w:val="22"/>
-              </w:rPr>
-              <w:t>annubar</w:t>
-            </w:r>
-            <w:proofErr w:type="spellEnd"/>
-            <w:r>
-              <w:rPr>
-                <w:szCs w:val="22"/>
-              </w:rPr>
-              <w:t xml:space="preserve"> test)</w:t>
+              <w:t xml:space="preserve"> (e.g. hydrant pump test water or SCV annubar test)</w:t>
             </w:r>
             <w:r>
               <w:rPr>
@@ -10325,7 +10254,7 @@
       </w:tr>
     </w:tbl>
     <w:p>
-      <w:bookmarkStart w:id="70" w:name="_Toc46738706"/>
+      <w:bookmarkStart w:id="69" w:name="_Toc46738706"/>
     </w:p>
     <w:p>
       <w:pPr>
@@ -10339,7 +10268,7 @@
       <w:pPr>
         <w:pStyle w:val="Heading2"/>
       </w:pPr>
-      <w:bookmarkStart w:id="71" w:name="_Toc231555527"/>
+      <w:bookmarkStart w:id="70" w:name="_Toc231555527"/>
       <w:r>
         <w:lastRenderedPageBreak/>
         <w:t xml:space="preserve">Operational </w:t>
@@ -10347,8 +10276,8 @@
       <w:r>
         <w:t>Energy</w:t>
       </w:r>
+      <w:bookmarkEnd w:id="69"/>
       <w:bookmarkEnd w:id="70"/>
-      <w:bookmarkEnd w:id="71"/>
     </w:p>
     <w:p>
       <w:pPr>
@@ -10593,23 +10522,9 @@
               <w:rPr>
                 <w:szCs w:val="22"/>
               </w:rPr>
-              <w:t xml:space="preserve">The National Construction Code (NCC) Class 2 – Sole Occupancy Unit(s) residential building component is to be designed in accordance with NCC Section J (2022) </w:t>
-            </w:r>
-            <w:proofErr w:type="spellStart"/>
-            <w:r>
-              <w:rPr>
-                <w:szCs w:val="22"/>
-              </w:rPr>
-              <w:t>NatHERS</w:t>
-            </w:r>
-            <w:proofErr w:type="spellEnd"/>
-            <w:r>
-              <w:rPr>
-                <w:szCs w:val="22"/>
-              </w:rPr>
-              <w:t xml:space="preserve"> requirements. The residential units must achieve an average </w:t>
-            </w:r>
-            <w:bookmarkStart w:id="72" w:name="FR_target"/>
+              <w:t xml:space="preserve">The National Construction Code (NCC) Class 2 – Sole Occupancy Unit(s) residential building component is to be designed in accordance with NCC Section J (2022) NatHERS requirements. The residential units must achieve an average </w:t>
+            </w:r>
+            <w:bookmarkStart w:id="71" w:name="FR_target"/>
             <w:r>
               <w:rPr>
                 <w:szCs w:val="22"/>
@@ -10620,7 +10535,7 @@
               <w:rPr>
                 <w:szCs w:val="22"/>
               </w:rPr>
-              <w:t>7.0</w:t>
+              <w:t>Average star rating</w:t>
             </w:r>
             <w:r>
               <w:rPr>
@@ -10634,7 +10549,7 @@
               </w:rPr>
               <w:t xml:space="preserve"> Star </w:t>
             </w:r>
-            <w:bookmarkEnd w:id="72"/>
+            <w:bookmarkEnd w:id="71"/>
             <w:r>
               <w:rPr>
                 <w:szCs w:val="22"/>
@@ -10898,7 +10813,7 @@
               </w:rPr>
               <w:t xml:space="preserve"> </w:t>
             </w:r>
-            <w:bookmarkStart w:id="73" w:name="Energy_NonRes"/>
+            <w:bookmarkStart w:id="72" w:name="Energy_NonRes"/>
             <w:r>
               <w:rPr>
                 <w:bCs/>
@@ -10925,7 +10840,7 @@
                 <w:bCs/>
                 <w:szCs w:val="22"/>
               </w:rPr>
-              <w:t>XX</w:t>
+              <w:t>improvement</w:t>
             </w:r>
             <w:r>
               <w:rPr>
@@ -10948,7 +10863,7 @@
               </w:rPr>
               <w:t xml:space="preserve"> </w:t>
             </w:r>
-            <w:bookmarkEnd w:id="73"/>
+            <w:bookmarkEnd w:id="72"/>
             <w:r>
               <w:rPr>
                 <w:bCs/>
@@ -10973,7 +10888,6 @@
               <w:jc w:val="both"/>
               <w:rPr>
                 <w:bCs/>
-                <w:szCs w:val="22"/>
               </w:rPr>
             </w:pPr>
             <w:r>
@@ -11027,6 +10941,106 @@
                 <w:bCs/>
               </w:rPr>
               <w:fldChar w:fldCharType="end"/>
+            </w:r>
+          </w:p>
+          <w:p>
+            <w:pPr>
+              <w:spacing w:before="0" w:after="0"/>
+              <w:jc w:val="both"/>
+              <w:rPr>
+                <w:bCs/>
+              </w:rPr>
+            </w:pPr>
+          </w:p>
+          <w:p>
+            <w:pPr>
+              <w:spacing w:before="120" w:after="120"/>
+              <w:rPr>
+                <w:bCs/>
+                <w:szCs w:val="22"/>
+              </w:rPr>
+            </w:pPr>
+            <w:bookmarkStart w:id="73" w:name="Thermal_Envelope"/>
+            <w:r>
+              <w:rPr>
+                <w:bCs/>
+                <w:szCs w:val="22"/>
+              </w:rPr>
+              <w:t>A</w:t>
+            </w:r>
+            <w:r>
+              <w:rPr>
+                <w:bCs/>
+                <w:szCs w:val="22"/>
+              </w:rPr>
+              <w:t xml:space="preserve">ll exposed floors and ceilings (forming part of the envelope) </w:t>
+            </w:r>
+            <w:r>
+              <w:rPr>
+                <w:bCs/>
+                <w:szCs w:val="22"/>
+              </w:rPr>
+              <w:t xml:space="preserve">to </w:t>
+            </w:r>
+            <w:r>
+              <w:rPr>
+                <w:bCs/>
+                <w:szCs w:val="22"/>
+              </w:rPr>
+              <w:t>demonstrate a minimum 10% improvement in required NCC2022 insulation levels</w:t>
+            </w:r>
+            <w:r>
+              <w:rPr>
+                <w:bCs/>
+                <w:szCs w:val="22"/>
+              </w:rPr>
+              <w:t>.</w:t>
+            </w:r>
+          </w:p>
+          <w:bookmarkEnd w:id="73"/>
+          <w:p>
+            <w:pPr>
+              <w:spacing w:before="0" w:after="0"/>
+              <w:jc w:val="both"/>
+              <w:rPr>
+                <w:bCs/>
+                <w:szCs w:val="22"/>
+              </w:rPr>
+            </w:pPr>
+            <w:r>
+              <w:rPr>
+                <w:bCs/>
+                <w:szCs w:val="22"/>
+              </w:rPr>
+              <w:t>A</w:t>
+            </w:r>
+            <w:r>
+              <w:rPr>
+                <w:bCs/>
+                <w:szCs w:val="22"/>
+              </w:rPr>
+              <w:t xml:space="preserve">ll wall and glazing </w:t>
+            </w:r>
+            <w:r>
+              <w:rPr>
+                <w:bCs/>
+                <w:szCs w:val="22"/>
+              </w:rPr>
+              <w:t xml:space="preserve">are to </w:t>
+            </w:r>
+            <w:r>
+              <w:rPr>
+                <w:bCs/>
+                <w:szCs w:val="22"/>
+              </w:rPr>
+              <w:t>meet the required NCC2022 facade calculator (or better than the total allowance)</w:t>
+            </w:r>
+            <w:r>
+              <w:rPr>
+                <w:bCs/>
+                <w:szCs w:val="22"/>
+              </w:rPr>
+              <w:t>. Refer Appendix X – Preliminary J4D6 BCA 2022 Façade Calculator</w:t>
             </w:r>
           </w:p>
         </w:tc>
@@ -11338,7 +11352,19 @@
               <w:rPr>
                 <w:szCs w:val="22"/>
               </w:rPr>
-              <w:t>[XX]</w:t>
+              <w:t>[</w:t>
+            </w:r>
+            <w:r>
+              <w:rPr>
+                <w:szCs w:val="22"/>
+              </w:rPr>
+              <w:t>Hot water</w:t>
+            </w:r>
+            <w:r>
+              <w:rPr>
+                <w:szCs w:val="22"/>
+              </w:rPr>
+              <w:t>]</w:t>
             </w:r>
           </w:p>
         </w:tc>
@@ -12028,7 +12054,7 @@
                 <w:color w:val="auto"/>
                 <w:szCs w:val="22"/>
               </w:rPr>
-              <w:t>XX</w:t>
+              <w:t>solar PV</w:t>
             </w:r>
             <w:r>
               <w:rPr>
@@ -12042,7 +12068,7 @@
                 <w:color w:val="auto"/>
                 <w:szCs w:val="22"/>
               </w:rPr>
-              <w:t>kW Solar PV system is to be located on the roof</w:t>
+              <w:t xml:space="preserve"> Solar PV system is to be located on the roof</w:t>
             </w:r>
             <w:bookmarkEnd w:id="76"/>
             <w:r>
@@ -12064,7 +12090,7 @@
                 <w:color w:val="auto"/>
                 <w:szCs w:val="22"/>
               </w:rPr>
-              <w:t>XX</w:t>
+              <w:t>Solar PV output</w:t>
             </w:r>
             <w:r>
               <w:rPr>
@@ -12555,13 +12581,12 @@
                     </w:rPr>
                     <w:fldChar w:fldCharType="separate"/>
                   </w:r>
-                  <w:proofErr w:type="gramStart"/>
                   <w:r>
                     <w:rPr>
                       <w:rFonts w:eastAsia="SimSun" w:cs="Calibri"/>
                       <w:color w:val="000000"/>
                     </w:rPr>
-                    <w:t>XX</w:t>
+                    <w:t>daylight living</w:t>
                   </w:r>
                   <w:r>
                     <w:rPr>
@@ -12577,7 +12602,6 @@
                     </w:rPr>
                     <w:t>%</w:t>
                   </w:r>
-                  <w:proofErr w:type="gramEnd"/>
                   <w:r>
                     <w:rPr>
                       <w:rFonts w:eastAsia="SimSun" w:cs="Calibri"/>
@@ -12652,13 +12676,12 @@
                     </w:rPr>
                     <w:fldChar w:fldCharType="separate"/>
                   </w:r>
-                  <w:proofErr w:type="gramStart"/>
                   <w:r>
                     <w:rPr>
                       <w:rFonts w:eastAsia="SimSun" w:cs="Calibri"/>
                       <w:color w:val="000000"/>
                     </w:rPr>
-                    <w:t>XX</w:t>
+                    <w:t>daylight bedrooms</w:t>
                   </w:r>
                   <w:r>
                     <w:rPr>
@@ -12674,7 +12697,6 @@
                     </w:rPr>
                     <w:t>%</w:t>
                   </w:r>
-                  <w:proofErr w:type="gramEnd"/>
                   <w:r>
                     <w:rPr>
                       <w:rFonts w:eastAsia="SimSun" w:cs="Calibri"/>
@@ -12787,19 +12809,11 @@
               <w:t xml:space="preserve"> </w:t>
             </w:r>
             <w:bookmarkStart w:id="82" w:name="DTS"/>
-            <w:proofErr w:type="gramStart"/>
-            <w:r>
-              <w:rPr>
-                <w:szCs w:val="22"/>
-              </w:rPr>
-              <w:t>The majority of</w:t>
-            </w:r>
-            <w:proofErr w:type="gramEnd"/>
-            <w:r>
-              <w:rPr>
-                <w:szCs w:val="22"/>
-              </w:rPr>
-              <w:t xml:space="preserve"> the development complies with the Deemed-to-Satisfy method for IEQ prescribed by BESS.</w:t>
+            <w:r>
+              <w:rPr>
+                <w:szCs w:val="22"/>
+              </w:rPr>
+              <w:t>The majority of the development complies with the Deemed-to-Satisfy method for IEQ prescribed by BESS.</w:t>
             </w:r>
             <w:bookmarkEnd w:id="82"/>
             <w:r>
@@ -12970,7 +12984,13 @@
               <w:rPr>
                 <w:szCs w:val="22"/>
               </w:rPr>
-              <w:t>XX% (XX out of XX)</w:t>
+              <w:t>natural ventilation</w:t>
+            </w:r>
+            <w:r>
+              <w:rPr>
+                <w:szCs w:val="22"/>
+              </w:rPr>
+              <w:t>% (XX out of XX)</w:t>
             </w:r>
             <w:r>
               <w:rPr>
@@ -13090,7 +13110,19 @@
               <w:rPr>
                 <w:szCs w:val="22"/>
               </w:rPr>
-              <w:t>[XX]</w:t>
+              <w:t>[</w:t>
+            </w:r>
+            <w:r>
+              <w:rPr>
+                <w:szCs w:val="22"/>
+              </w:rPr>
+              <w:t>daylight non-resi</w:t>
+            </w:r>
+            <w:r>
+              <w:rPr>
+                <w:szCs w:val="22"/>
+              </w:rPr>
+              <w:t>]</w:t>
             </w:r>
             <w:r>
               <w:rPr>
@@ -13276,7 +13308,13 @@
               <w:rPr>
                 <w:szCs w:val="22"/>
               </w:rPr>
-              <w:t xml:space="preserve">XX% </w:t>
+              <w:t>winter sunlight</w:t>
+            </w:r>
+            <w:r>
+              <w:rPr>
+                <w:szCs w:val="22"/>
+              </w:rPr>
+              <w:t xml:space="preserve">% </w:t>
             </w:r>
             <w:bookmarkEnd w:id="85"/>
             <w:r>
@@ -13317,21 +13355,12 @@
                 <w:lang w:val="fr-FR"/>
               </w:rPr>
             </w:pPr>
-            <w:proofErr w:type="spellStart"/>
             <w:r>
               <w:rPr>
                 <w:szCs w:val="22"/>
                 <w:lang w:val="fr-FR"/>
               </w:rPr>
-              <w:t>Refer</w:t>
-            </w:r>
-            <w:proofErr w:type="spellEnd"/>
-            <w:r>
-              <w:rPr>
-                <w:szCs w:val="22"/>
-                <w:lang w:val="fr-FR"/>
-              </w:rPr>
-              <w:t xml:space="preserve"> </w:t>
+              <w:t xml:space="preserve">Refer </w:t>
             </w:r>
             <w:r>
               <w:fldChar w:fldCharType="begin"/>
@@ -13385,18 +13414,8 @@
                 <w:color w:val="00602B" w:themeColor="text2"/>
                 <w:szCs w:val="22"/>
               </w:rPr>
-              <w:t xml:space="preserve">Ventilation – </w:t>
-            </w:r>
-            <w:proofErr w:type="gramStart"/>
-            <w:r>
-              <w:rPr>
-                <w:rFonts w:ascii="Roboto" w:hAnsi="Roboto"/>
-                <w:color w:val="00602B" w:themeColor="text2"/>
-                <w:szCs w:val="22"/>
-              </w:rPr>
-              <w:t>Non-Residential</w:t>
-            </w:r>
-            <w:proofErr w:type="gramEnd"/>
+              <w:t>Ventilation – Non-Residential</w:t>
+            </w:r>
           </w:p>
         </w:tc>
         <w:tc>
@@ -13436,7 +13455,13 @@
               <w:jc w:val="both"/>
             </w:pPr>
             <w:r>
-              <w:t>[XX]</w:t>
+              <w:t>[</w:t>
+            </w:r>
+            <w:r>
+              <w:t>ventilation non-resi</w:t>
+            </w:r>
+            <w:r>
+              <w:t>]</w:t>
             </w:r>
           </w:p>
           <w:p>
@@ -13550,34 +13575,7 @@
               <w:rPr>
                 <w:szCs w:val="22"/>
               </w:rPr>
-              <w:t>XXX</w:t>
-            </w:r>
-            <w:r>
-              <w:rPr>
-                <w:szCs w:val="22"/>
-              </w:rPr>
-              <w:t>.</w:t>
-            </w:r>
-          </w:p>
-          <w:p>
-            <w:pPr>
-              <w:pStyle w:val="ListBullet"/>
-              <w:jc w:val="both"/>
-              <w:rPr>
-                <w:szCs w:val="22"/>
-              </w:rPr>
-            </w:pPr>
-            <w:r>
-              <w:rPr>
-                <w:szCs w:val="22"/>
-              </w:rPr>
-              <w:t>XXX</w:t>
-            </w:r>
-            <w:r>
-              <w:rPr>
-                <w:szCs w:val="22"/>
-              </w:rPr>
-              <w:t>.</w:t>
+              <w:t>[Shading]</w:t>
             </w:r>
           </w:p>
         </w:tc>
@@ -13670,25 +13668,7 @@
               <w:rPr>
                 <w:szCs w:val="22"/>
               </w:rPr>
-              <w:t>XXX</w:t>
-            </w:r>
-            <w:r>
-              <w:rPr>
-                <w:szCs w:val="22"/>
-              </w:rPr>
-              <w:t>.</w:t>
-            </w:r>
-          </w:p>
-          <w:p>
-            <w:pPr>
-              <w:pStyle w:val="ListBullet"/>
-              <w:jc w:val="both"/>
-              <w:rPr>
-                <w:szCs w:val="22"/>
-              </w:rPr>
-            </w:pPr>
-            <w:r>
-              <w:t>XXX.</w:t>
+              <w:t>[Shading non-resi]</w:t>
             </w:r>
           </w:p>
         </w:tc>
@@ -13752,7 +13732,7 @@
               <w:rPr>
                 <w:szCs w:val="22"/>
               </w:rPr>
-              <w:t>XX</w:t>
+              <w:t>fans</w:t>
             </w:r>
             <w:r>
               <w:rPr>
@@ -14240,7 +14220,7 @@
               <w:rPr>
                 <w:szCs w:val="22"/>
               </w:rPr>
-              <w:t>XX</w:t>
+              <w:t>residential bikes</w:t>
             </w:r>
             <w:r>
               <w:rPr>
@@ -14294,7 +14274,7 @@
               <w:rPr>
                 <w:szCs w:val="22"/>
               </w:rPr>
-              <w:t>XX</w:t>
+              <w:t>residential visitor bikes</w:t>
             </w:r>
             <w:r>
               <w:rPr>
@@ -14313,21 +14293,7 @@
               <w:rPr>
                 <w:szCs w:val="22"/>
               </w:rPr>
-              <w:t xml:space="preserve"> This will provide a ratio of approximately 1 visitor bicycle space for every X </w:t>
-            </w:r>
-            <w:proofErr w:type="gramStart"/>
-            <w:r>
-              <w:rPr>
-                <w:szCs w:val="22"/>
-              </w:rPr>
-              <w:t>apartments</w:t>
-            </w:r>
-            <w:proofErr w:type="gramEnd"/>
-            <w:r>
-              <w:rPr>
-                <w:szCs w:val="22"/>
-              </w:rPr>
-              <w:t>.</w:t>
+              <w:t xml:space="preserve"> This will provide a ratio of approximately 1 visitor bicycle space for every X apartments.</w:t>
             </w:r>
           </w:p>
         </w:tc>
@@ -14426,7 +14392,7 @@
               <w:rPr>
                 <w:szCs w:val="22"/>
               </w:rPr>
-              <w:t>XX</w:t>
+              <w:t>employee bikes</w:t>
             </w:r>
             <w:r>
               <w:rPr>
@@ -14480,7 +14446,7 @@
               <w:rPr>
                 <w:szCs w:val="22"/>
               </w:rPr>
-              <w:t>XX</w:t>
+              <w:t>commercial visitor bikes</w:t>
             </w:r>
             <w:r>
               <w:rPr>
@@ -14607,7 +14573,7 @@
               <w:rPr>
                 <w:szCs w:val="22"/>
               </w:rPr>
-              <w:t>XX</w:t>
+              <w:t>EOT showers</w:t>
             </w:r>
             <w:r>
               <w:rPr>
@@ -14631,7 +14597,7 @@
               <w:rPr>
                 <w:szCs w:val="22"/>
               </w:rPr>
-              <w:t>XX</w:t>
+              <w:t>EOT lockers</w:t>
             </w:r>
             <w:r>
               <w:rPr>
@@ -14987,7 +14953,19 @@
               <w:rPr>
                 <w:szCs w:val="22"/>
               </w:rPr>
-              <w:t>[XX]</w:t>
+              <w:t>[</w:t>
+            </w:r>
+            <w:r>
+              <w:rPr>
+                <w:szCs w:val="22"/>
+              </w:rPr>
+              <w:t>motorbikes</w:t>
+            </w:r>
+            <w:r>
+              <w:rPr>
+                <w:szCs w:val="22"/>
+              </w:rPr>
+              <w:t>]</w:t>
             </w:r>
             <w:r>
               <w:rPr>
@@ -15289,21 +15267,7 @@
               <w:rPr>
                 <w:szCs w:val="22"/>
               </w:rPr>
-              <w:t xml:space="preserve">Concrete mixes used within the project will seek to reduce Portland cement and aggregate content </w:t>
-            </w:r>
-            <w:proofErr w:type="gramStart"/>
-            <w:r>
-              <w:rPr>
-                <w:szCs w:val="22"/>
-              </w:rPr>
-              <w:t>where</w:t>
-            </w:r>
-            <w:proofErr w:type="gramEnd"/>
-            <w:r>
-              <w:rPr>
-                <w:szCs w:val="22"/>
-              </w:rPr>
-              <w:t xml:space="preserve"> deemed appropriate by the structural engineer. </w:t>
+              <w:t xml:space="preserve">Concrete mixes used within the project will seek to reduce Portland cement and aggregate content where deemed appropriate by the structural engineer. </w:t>
             </w:r>
           </w:p>
           <w:p>
@@ -15750,21 +15714,7 @@
               <w:rPr>
                 <w:szCs w:val="22"/>
               </w:rPr>
-              <w:t xml:space="preserve">The project will incorporate products that meet the transparency and sustainability requirements </w:t>
-            </w:r>
-            <w:proofErr w:type="gramStart"/>
-            <w:r>
-              <w:rPr>
-                <w:szCs w:val="22"/>
-              </w:rPr>
-              <w:t>where</w:t>
-            </w:r>
-            <w:proofErr w:type="gramEnd"/>
-            <w:r>
-              <w:rPr>
-                <w:szCs w:val="22"/>
-              </w:rPr>
-              <w:t xml:space="preserve"> deemed appropriate. This includes the following: reused products, recycled content products, environmental product declarations, third party certified and stewardship programs.</w:t>
+              <w:t>The project will incorporate products that meet the transparency and sustainability requirements where deemed appropriate. This includes the following: reused products, recycled content products, environmental product declarations, third party certified and stewardship programs.</w:t>
             </w:r>
           </w:p>
         </w:tc>
@@ -16361,21 +16311,7 @@
                 <w:szCs w:val="22"/>
               </w:rPr>
               <w:br/>
-              <w:t xml:space="preserve">Each tenancy is to be provided with separate general, recycling and food and organics waste bins. This requirement is to be included in the </w:t>
-            </w:r>
-            <w:proofErr w:type="gramStart"/>
-            <w:r>
-              <w:rPr>
-                <w:szCs w:val="22"/>
-              </w:rPr>
-              <w:t>owners</w:t>
-            </w:r>
-            <w:proofErr w:type="gramEnd"/>
-            <w:r>
-              <w:rPr>
-                <w:szCs w:val="22"/>
-              </w:rPr>
-              <w:t xml:space="preserve"> corporation rules or lease agreement.</w:t>
+              <w:t>Each tenancy is to be provided with separate general, recycling and food and organics waste bins. This requirement is to be included in the owners corporation rules or lease agreement.</w:t>
             </w:r>
             <w:r>
               <w:rPr>
@@ -16717,7 +16653,7 @@
               <w:rPr>
                 <w:szCs w:val="22"/>
               </w:rPr>
-              <w:t>XX</w:t>
+              <w:t>communal area</w:t>
             </w:r>
             <w:r>
               <w:rPr>
@@ -16915,7 +16851,7 @@
               <w:rPr>
                 <w:szCs w:val="22"/>
               </w:rPr>
-              <w:t>XX</w:t>
+              <w:t>vegetation</w:t>
             </w:r>
             <w:r>
               <w:rPr>
@@ -17215,7 +17151,7 @@
               <w:rPr>
                 <w:szCs w:val="22"/>
               </w:rPr>
-              <w:t>XX</w:t>
+              <w:t>food production area</w:t>
             </w:r>
             <w:r>
               <w:rPr>
@@ -17324,21 +17260,7 @@
               <w:rPr>
                 <w:szCs w:val="22"/>
               </w:rPr>
-              <w:t xml:space="preserve">Roofs are to have a </w:t>
-            </w:r>
-            <w:proofErr w:type="gramStart"/>
-            <w:r>
-              <w:rPr>
-                <w:szCs w:val="22"/>
-              </w:rPr>
-              <w:t>three year</w:t>
-            </w:r>
-            <w:proofErr w:type="gramEnd"/>
-            <w:r>
-              <w:rPr>
-                <w:szCs w:val="22"/>
-              </w:rPr>
-              <w:t xml:space="preserve"> SRI of minimum 60</w:t>
+              <w:t>Roofs are to have a three year SRI of minimum 60</w:t>
             </w:r>
             <w:r>
               <w:rPr>
@@ -17365,21 +17287,7 @@
               <w:rPr>
                 <w:szCs w:val="22"/>
               </w:rPr>
-              <w:t xml:space="preserve">Unshaded hard-scaping elements are to have a </w:t>
-            </w:r>
-            <w:proofErr w:type="gramStart"/>
-            <w:r>
-              <w:rPr>
-                <w:szCs w:val="22"/>
-              </w:rPr>
-              <w:t>three year</w:t>
-            </w:r>
-            <w:proofErr w:type="gramEnd"/>
-            <w:r>
-              <w:rPr>
-                <w:szCs w:val="22"/>
-              </w:rPr>
-              <w:t xml:space="preserve"> SRI of minimum 40.</w:t>
+              <w:t>Unshaded hard-scaping elements are to have a three year SRI of minimum 40.</w:t>
             </w:r>
           </w:p>
         </w:tc>
@@ -17814,21 +17722,7 @@
               <w:rPr>
                 <w:szCs w:val="22"/>
               </w:rPr>
-              <w:t xml:space="preserve">The proposed development will be established with a carbon neutral power agreement between developer, owner’s corporation, and electrical retailer to provide </w:t>
-            </w:r>
-            <w:proofErr w:type="spellStart"/>
-            <w:r>
-              <w:rPr>
-                <w:szCs w:val="22"/>
-              </w:rPr>
-              <w:t>GreenPower</w:t>
-            </w:r>
-            <w:proofErr w:type="spellEnd"/>
-            <w:r>
-              <w:rPr>
-                <w:szCs w:val="22"/>
-              </w:rPr>
-              <w:t xml:space="preserve"> for all energy consumed by building (including communal areas, apartments and retail tenancy). It is the intent to maintain this agreement for a minimum of 10 years. </w:t>
+              <w:t xml:space="preserve">The proposed development will be established with a carbon neutral power agreement between developer, owner’s corporation, and electrical retailer to provide GreenPower for all energy consumed by building (including communal areas, apartments and retail tenancy). It is the intent to maintain this agreement for a minimum of 10 years. </w:t>
             </w:r>
           </w:p>
         </w:tc>
@@ -18142,29 +18036,19 @@
         <w:fldChar w:fldCharType="separate"/>
       </w:r>
       <w:r>
-        <w:t>Rainwater is to be collected from XX and directed into the</w:t>
+        <w:t xml:space="preserve">Rainwater is to be collected from </w:t>
       </w:r>
       <w:r>
-        <w:t xml:space="preserve"> </w:t>
-      </w:r>
-      <w:proofErr w:type="gramStart"/>
-      <w:r>
-        <w:t>[XX]</w:t>
+        <w:t>[collection area]m2</w:t>
       </w:r>
       <w:r>
-        <w:t xml:space="preserve"> litre</w:t>
+        <w:t xml:space="preserve"> and directed into the</w:t>
       </w:r>
-      <w:proofErr w:type="gramEnd"/>
       <w:r>
-        <w:t xml:space="preserve"> rainwater tank. XX </w:t>
+        <w:t xml:space="preserve"> [rainwater tank size]</w:t>
       </w:r>
-      <w:proofErr w:type="gramStart"/>
       <w:r>
-        <w:t>WC’s</w:t>
-      </w:r>
-      <w:proofErr w:type="gramEnd"/>
-      <w:r>
-        <w:t xml:space="preserve"> are to be connected to the rainwater tank.</w:t>
+        <w:t xml:space="preserve"> litre rainwater tank. XX WC’s are to be connected to the rainwater tank.</w:t>
       </w:r>
     </w:p>
     <w:p>
@@ -18174,7 +18058,13 @@
         <w:jc w:val="both"/>
       </w:pPr>
       <w:r>
-        <w:t>Rainwater is to be collected from XX and directed into a ≥XXm2, minimum 1,150mm deep raingarden with 300mm of extended detention.</w:t>
+        <w:t>Rainwater is to be collected from XX and directed into a ≥</w:t>
+      </w:r>
+      <w:r>
+        <w:t>[raingarden size]</w:t>
+      </w:r>
+      <w:r>
+        <w:t>m2, minimum 1,150mm deep raingarden with 300mm of extended detention.</w:t>
       </w:r>
     </w:p>
     <w:p>
@@ -18288,7 +18178,7 @@
         <w:rPr>
           <w:highlight w:val="yellow"/>
         </w:rPr>
-        <w:t>XX</w:t>
+        <w:t>rainwater tank size</w:t>
       </w:r>
       <w:r>
         <w:rPr>
@@ -18526,7 +18416,19 @@
         <w:rPr>
           <w:highlight w:val="yellow"/>
         </w:rPr>
-        <w:t>a ≥XXm</w:t>
+        <w:t>a ≥</w:t>
+      </w:r>
+      <w:r>
+        <w:rPr>
+          <w:highlight w:val="yellow"/>
+        </w:rPr>
+        <w:t>[raingarden size]</w:t>
+      </w:r>
+      <w:r>
+        <w:rPr>
+          <w:highlight w:val="yellow"/>
+        </w:rPr>
+        <w:t>m</w:t>
       </w:r>
       <w:r>
         <w:rPr>
@@ -18816,15 +18718,7 @@
         <w:jc w:val="both"/>
       </w:pPr>
       <w:r>
-        <w:t xml:space="preserve">Introduction of offsite construction for building elements </w:t>
-      </w:r>
-      <w:proofErr w:type="gramStart"/>
-      <w:r>
-        <w:t>where</w:t>
-      </w:r>
-      <w:proofErr w:type="gramEnd"/>
-      <w:r>
-        <w:t xml:space="preserve"> deemed appropriate.</w:t>
+        <w:t>Introduction of offsite construction for building elements where deemed appropriate.</w:t>
       </w:r>
     </w:p>
     <w:p>
@@ -19743,21 +19637,7 @@
               <w:rPr>
                 <w:szCs w:val="22"/>
               </w:rPr>
-              <w:t xml:space="preserve">Clear inflow points of </w:t>
-            </w:r>
-            <w:proofErr w:type="gramStart"/>
-            <w:r>
-              <w:rPr>
-                <w:szCs w:val="22"/>
-              </w:rPr>
-              <w:t>built up</w:t>
-            </w:r>
-            <w:proofErr w:type="gramEnd"/>
-            <w:r>
-              <w:rPr>
-                <w:szCs w:val="22"/>
-              </w:rPr>
-              <w:t xml:space="preserve"> sediment, rubbish and leaves.  </w:t>
+              <w:t xml:space="preserve">Clear inflow points of built up sediment, rubbish and leaves.  </w:t>
             </w:r>
           </w:p>
           <w:p>
@@ -20317,21 +20197,7 @@
         <w:rPr>
           <w:rFonts w:eastAsia="Times New Roman" w:cs="Times New Roman"/>
         </w:rPr>
-        <w:t xml:space="preserve">The National Construction Code (NCC) Class 2 – Sole Occupancy Unit(s) residential building component is to be designed in accordance with NCC Section J (2022) </w:t>
-      </w:r>
-      <w:proofErr w:type="spellStart"/>
-      <w:r>
-        <w:rPr>
-          <w:rFonts w:eastAsia="Times New Roman" w:cs="Times New Roman"/>
-        </w:rPr>
-        <w:t>NatHERS</w:t>
-      </w:r>
-      <w:proofErr w:type="spellEnd"/>
-      <w:r>
-        <w:rPr>
-          <w:rFonts w:eastAsia="Times New Roman" w:cs="Times New Roman"/>
-        </w:rPr>
-        <w:t xml:space="preserve"> requirements. The residential units must achieve an average </w:t>
+        <w:t xml:space="preserve">The National Construction Code (NCC) Class 2 – Sole Occupancy Unit(s) residential building component is to be designed in accordance with NCC Section J (2022) NatHERS requirements. The residential units must achieve an average </w:t>
       </w:r>
       <w:r>
         <w:rPr>
@@ -20767,27 +20633,7 @@
           <w:color w:val="auto"/>
           <w:szCs w:val="22"/>
         </w:rPr>
-        <w:t xml:space="preserve">The apartments are currently achieving a X.X Star average. The below sample ratings demonstrate the </w:t>
-      </w:r>
-      <w:proofErr w:type="gramStart"/>
-      <w:r>
-        <w:rPr>
-          <w:rFonts w:ascii="Roboto Light" w:hAnsi="Roboto Light"/>
-          <w:b w:val="0"/>
-          <w:color w:val="auto"/>
-          <w:szCs w:val="22"/>
-        </w:rPr>
-        <w:t>developments</w:t>
-      </w:r>
-      <w:proofErr w:type="gramEnd"/>
-      <w:r>
-        <w:rPr>
-          <w:rFonts w:ascii="Roboto Light" w:hAnsi="Roboto Light"/>
-          <w:b w:val="0"/>
-          <w:color w:val="auto"/>
-          <w:szCs w:val="22"/>
-        </w:rPr>
-        <w:t xml:space="preserve"> ability to achieve </w:t>
+        <w:t xml:space="preserve">The apartments are currently achieving a X.X Star average. The below sample ratings demonstrate the developments ability to achieve </w:t>
       </w:r>
       <w:r>
         <w:rPr>
@@ -20914,7 +20760,6 @@
                 <w:color w:val="00602B" w:themeColor="accent1"/>
               </w:rPr>
             </w:pPr>
-            <w:proofErr w:type="gramStart"/>
             <w:r>
               <w:rPr>
                 <w:rFonts w:ascii="Roboto" w:hAnsi="Roboto"/>
@@ -20922,7 +20767,6 @@
               </w:rPr>
               <w:t>ACE  Heating</w:t>
             </w:r>
-            <w:proofErr w:type="gramEnd"/>
             <w:r>
               <w:rPr>
                 <w:rFonts w:ascii="Roboto" w:hAnsi="Roboto"/>
@@ -20957,7 +20801,6 @@
                 <w:color w:val="00602B" w:themeColor="accent1"/>
               </w:rPr>
             </w:pPr>
-            <w:proofErr w:type="gramStart"/>
             <w:r>
               <w:rPr>
                 <w:rFonts w:ascii="Roboto" w:hAnsi="Roboto"/>
@@ -20965,7 +20808,6 @@
               </w:rPr>
               <w:t>ACE  Cooling</w:t>
             </w:r>
-            <w:proofErr w:type="gramEnd"/>
             <w:r>
               <w:rPr>
                 <w:rFonts w:ascii="Roboto" w:hAnsi="Roboto"/>
@@ -21000,7 +20842,6 @@
                 <w:color w:val="00602B" w:themeColor="accent1"/>
               </w:rPr>
             </w:pPr>
-            <w:proofErr w:type="gramStart"/>
             <w:r>
               <w:rPr>
                 <w:rFonts w:ascii="Roboto" w:hAnsi="Roboto"/>
@@ -21008,7 +20849,6 @@
               </w:rPr>
               <w:t>ACE  NCFA</w:t>
             </w:r>
-            <w:proofErr w:type="gramEnd"/>
           </w:p>
         </w:tc>
         <w:tc>
@@ -22197,7 +22037,6 @@
                 <w:szCs w:val="22"/>
               </w:rPr>
             </w:pPr>
-            <w:proofErr w:type="gramStart"/>
             <w:r>
               <w:rPr>
                 <w:rFonts w:ascii="Roboto Light" w:hAnsi="Roboto Light"/>
@@ -22206,7 +22045,6 @@
               </w:rPr>
               <w:t>RX.X+RX.X</w:t>
             </w:r>
-            <w:proofErr w:type="gramEnd"/>
           </w:p>
         </w:tc>
       </w:tr>
@@ -22438,26 +22276,16 @@
                 <w:b w:val="0"/>
                 <w:szCs w:val="22"/>
               </w:rPr>
-              <w:t xml:space="preserve"> Argon </w:t>
-            </w:r>
-            <w:proofErr w:type="gramStart"/>
+              <w:t xml:space="preserve"> Argon filled, </w:t>
+            </w:r>
             <w:r>
               <w:rPr>
                 <w:rFonts w:ascii="Roboto Light" w:hAnsi="Roboto Light"/>
                 <w:b w:val="0"/>
                 <w:szCs w:val="22"/>
               </w:rPr>
-              <w:t xml:space="preserve">filled, </w:t>
-            </w:r>
-            <w:r>
-              <w:rPr>
-                <w:rFonts w:ascii="Roboto Light" w:hAnsi="Roboto Light"/>
-                <w:b w:val="0"/>
-                <w:szCs w:val="22"/>
-              </w:rPr>
               <w:t xml:space="preserve"> Clear</w:t>
             </w:r>
-            <w:proofErr w:type="gramEnd"/>
           </w:p>
         </w:tc>
         <w:tc>
@@ -22608,26 +22436,16 @@
                 <w:b w:val="0"/>
                 <w:szCs w:val="22"/>
               </w:rPr>
-              <w:t xml:space="preserve"> Argon </w:t>
-            </w:r>
-            <w:proofErr w:type="gramStart"/>
+              <w:t xml:space="preserve"> Argon filled, </w:t>
+            </w:r>
             <w:r>
               <w:rPr>
                 <w:rFonts w:ascii="Roboto Light" w:hAnsi="Roboto Light"/>
                 <w:b w:val="0"/>
                 <w:szCs w:val="22"/>
               </w:rPr>
-              <w:t xml:space="preserve">filled, </w:t>
-            </w:r>
-            <w:r>
-              <w:rPr>
-                <w:rFonts w:ascii="Roboto Light" w:hAnsi="Roboto Light"/>
-                <w:b w:val="0"/>
-                <w:szCs w:val="22"/>
-              </w:rPr>
               <w:t xml:space="preserve"> Clear</w:t>
             </w:r>
-            <w:proofErr w:type="gramEnd"/>
           </w:p>
         </w:tc>
         <w:tc>
@@ -22819,7 +22637,6 @@
       <w:pPr>
         <w:pStyle w:val="Heading3"/>
       </w:pPr>
-      <w:proofErr w:type="spellStart"/>
       <w:r>
         <w:rPr>
           <w:highlight w:val="yellow"/>
@@ -22836,14 +22653,7 @@
         <w:rPr>
           <w:highlight w:val="yellow"/>
         </w:rPr>
-        <w:t>atts</w:t>
-      </w:r>
-      <w:proofErr w:type="spellEnd"/>
-      <w:r>
-        <w:rPr>
-          <w:highlight w:val="yellow"/>
-        </w:rPr>
-        <w:t xml:space="preserve"> Calculator</w:t>
+        <w:t>atts Calculator</w:t>
       </w:r>
       <w:r>
         <w:br w:type="page"/>
@@ -33530,6 +33340,7 @@
     <w:pitch w:val="default"/>
   </w:font>
   <w:font w:name="Roboto">
+    <w:altName w:val="Arial"/>
     <w:panose1 w:val="02000000000000000000"/>
     <w:charset w:val="00"/>
     <w:family w:val="auto"/>
@@ -33927,6 +33738,8 @@
     <w:rsid w:val="00022123"/>
     <w:rsid w:val="0002364D"/>
     <w:rsid w:val="000237AA"/>
+    <w:rsid w:val="000669B7"/>
+    <w:rsid w:val="000721F3"/>
     <w:rsid w:val="00076F93"/>
     <w:rsid w:val="0008015E"/>
     <w:rsid w:val="00093550"/>
@@ -33945,7 +33758,9 @@
     <w:rsid w:val="001F774D"/>
     <w:rsid w:val="0024754E"/>
     <w:rsid w:val="002476EF"/>
+    <w:rsid w:val="00265BF8"/>
     <w:rsid w:val="00280C54"/>
+    <w:rsid w:val="002870BB"/>
     <w:rsid w:val="002A4853"/>
     <w:rsid w:val="002D0D3A"/>
     <w:rsid w:val="002D200A"/>
@@ -33957,6 +33772,7 @@
     <w:rsid w:val="00355486"/>
     <w:rsid w:val="00355A99"/>
     <w:rsid w:val="0037731B"/>
+    <w:rsid w:val="003929AC"/>
     <w:rsid w:val="003C40DB"/>
     <w:rsid w:val="003E7BDB"/>
     <w:rsid w:val="003E7D56"/>
@@ -33968,12 +33784,14 @@
     <w:rsid w:val="004558F6"/>
     <w:rsid w:val="00460782"/>
     <w:rsid w:val="004D7895"/>
+    <w:rsid w:val="004E483C"/>
     <w:rsid w:val="00504E04"/>
     <w:rsid w:val="00524716"/>
     <w:rsid w:val="005437BF"/>
     <w:rsid w:val="00547074"/>
     <w:rsid w:val="005533A3"/>
     <w:rsid w:val="00577CC4"/>
+    <w:rsid w:val="005946A7"/>
     <w:rsid w:val="005B679C"/>
     <w:rsid w:val="005B743B"/>
     <w:rsid w:val="005C3A6B"/>
@@ -33984,6 +33802,7 @@
     <w:rsid w:val="00635930"/>
     <w:rsid w:val="00644C13"/>
     <w:rsid w:val="006718F4"/>
+    <w:rsid w:val="00680F0B"/>
     <w:rsid w:val="0069527B"/>
     <w:rsid w:val="006A4FF8"/>
     <w:rsid w:val="006A71BB"/>
@@ -34009,6 +33828,7 @@
     <w:rsid w:val="00887C5F"/>
     <w:rsid w:val="008A5DF4"/>
     <w:rsid w:val="008C6991"/>
+    <w:rsid w:val="008D618A"/>
     <w:rsid w:val="008E3168"/>
     <w:rsid w:val="008E5806"/>
     <w:rsid w:val="008F56B5"/>
@@ -34017,6 +33837,7 @@
     <w:rsid w:val="0093443B"/>
     <w:rsid w:val="00946496"/>
     <w:rsid w:val="0095765B"/>
+    <w:rsid w:val="009622D5"/>
     <w:rsid w:val="0096582F"/>
     <w:rsid w:val="00975BDB"/>
     <w:rsid w:val="009875D4"/>
@@ -34030,8 +33851,10 @@
     <w:rsid w:val="00A36613"/>
     <w:rsid w:val="00A44511"/>
     <w:rsid w:val="00A474E6"/>
+    <w:rsid w:val="00A5620E"/>
     <w:rsid w:val="00A70FF1"/>
     <w:rsid w:val="00AC4FCD"/>
+    <w:rsid w:val="00AE5972"/>
     <w:rsid w:val="00AE63FD"/>
     <w:rsid w:val="00AF3821"/>
     <w:rsid w:val="00B27560"/>
@@ -34040,6 +33863,7 @@
     <w:rsid w:val="00B44A2D"/>
     <w:rsid w:val="00B54FD0"/>
     <w:rsid w:val="00B6793A"/>
+    <w:rsid w:val="00B75F9D"/>
     <w:rsid w:val="00B771CA"/>
     <w:rsid w:val="00B96785"/>
     <w:rsid w:val="00BB5A18"/>
@@ -34052,6 +33876,7 @@
     <w:rsid w:val="00C67CAB"/>
     <w:rsid w:val="00C820F1"/>
     <w:rsid w:val="00C862C5"/>
+    <w:rsid w:val="00CA3F89"/>
     <w:rsid w:val="00CA5D56"/>
     <w:rsid w:val="00CC4EEB"/>
     <w:rsid w:val="00CC50E7"/>
@@ -34533,10 +34358,7 @@
     <w:basedOn w:val="DefaultParagraphFont"/>
     <w:uiPriority w:val="99"/>
     <w:semiHidden/>
-    <w:rsid w:val="0093443B"/>
-    <w:rPr>
-      <w:color w:val="808080"/>
-    </w:rPr>
+    <w:rsid w:val="008D618A"/>
   </w:style>
   <w:style w:type="paragraph" w:customStyle="1" w:styleId="71ADB0C41D9DEE44BAF13E2629C6DC2E">
     <w:name w:val="71ADB0C41D9DEE44BAF13E2629C6DC2E"/>

</xml_diff>